<commit_message>
WP09: kalibracja pakietu TRANSLOG 16+8 tys., kurs NBP 4,2836, wskaźnik przychodów poza RP 0 zł, de minimis 0 zł
Co-Authored-By: Claude Sonnet 5.5 <noreply@anthropic.com>
Claude-Session: https://claude.ai/code/session_01672WnJhixnEcarbb7uiwfx
</commit_message>
<xml_diff>
--- a/Sekcja_3.2_internacjonalizacja_Z10_Z11.docx
+++ b/Sekcja_3.2_internacjonalizacja_Z10_Z11.docx
@@ -15,7 +15,7 @@
         <w:rPr>
           <w:b w:val="0"/>
         </w:rPr>
-        <w:t>Wniosek FENG.01.01-IP.01-A1RR/26, CargoDT. Pakiet WP09 (uwagi K3-23, K3-24, K3-59 do K3-66, K14-01). Teksty są gotowe do wklejenia. Na żółto zaznaczono tylko dane z oferty organizatora kongresu i kurs NBP, które musisz wpisać Ty (część 8).</w:t>
+        <w:t>Wniosek FENG.01.01-IP.01-A1RR/26, CargoDT. Pakiet WP09 (uwagi K3-23, K3-24, K3-59 do K3-66, K14-01). Teksty są gotowe do wklejenia, bez pól do uzupełnienia. Zadania po Twojej stronie są w części 8.</w:t>
       </w:r>
     </w:p>
     <w:p>
@@ -191,7 +191,7 @@
                 <w:b w:val="0"/>
                 <w:sz w:val="18"/>
               </w:rPr>
-              <w:t>Podróże nie wymagają kursu (stawka w PLN). Dla opłat EPO podano kurs planistyczny 4,50 i kurs średni NBP z dnia ogłoszenia naboru, 09.03.2026.</w:t>
+              <w:t>Podróże nie wymagają kursu (stawka w PLN). Dla opłat EPO podano kurs średni NBP z dnia ogłoszenia naboru 09.03.2026 (4,2836 PLN/EUR) i kurs planistyczny 4,50 z buforem 5%.</w:t>
             </w:r>
           </w:p>
         </w:tc>
@@ -255,7 +255,7 @@
                 <w:b w:val="0"/>
                 <w:sz w:val="18"/>
               </w:rPr>
-              <w:t>Pakiet 24 000 zł rozdzielony na rezerwację i rejestrację (de minimis, 5.3.8) oraz wynajem i obsługę stoiska (art. 19, 5.3.2). Kwoty z oferty organizatora.</w:t>
+              <w:t>Pakiet 24 000 zł rozdzielony na rezerwację i rejestrację (de minimis, 5.3.8) oraz wynajem i obsługę stoiska (art. 19, 5.3.2). Organizator nie publikuje cennika, więc podział (16 000 zł i 8 000 zł) jest oszacowaniem według struktury oferty, z odwołaniem do korespondencji e-mail z organizatorem.</w:t>
             </w:r>
           </w:p>
         </w:tc>
@@ -351,7 +351,7 @@
                 <w:b w:val="0"/>
                 <w:sz w:val="18"/>
               </w:rPr>
-              <w:t>Wskaźnik przychodów poza RP: rok 2030, wartość 9 600 zł zamiast całości przychodów (489 300 zł). Zob. część 6.</w:t>
+              <w:t>Wskaźnik przychodów poza RP: rok 2030 (rok po zakończeniu projektu), wartość 0 zł zamiast całości przychodów z Polski (489 300 zł). Zob. część 6.</w:t>
             </w:r>
           </w:p>
         </w:tc>
@@ -506,7 +506,7 @@
           <w:color w:val="666666"/>
           <w:sz w:val="17"/>
         </w:rPr>
-        <w:t xml:space="preserve"> [1696 znaków]</w:t>
+        <w:t xml:space="preserve"> [1825 znaków]</w:t>
       </w:r>
     </w:p>
     <w:p>
@@ -572,7 +572,7 @@
         <w:rPr>
           <w:b w:val="0"/>
         </w:rPr>
-        <w:t>Cel handlowy: co najmniej 2 umowy licencji API z dostawcami TMS lub giełdami w regionie CEE w 2030 r., zgodnie z wskaźnikiem przychodów poza RP w sekcji 8.2.</w:t>
+        <w:t>Cel handlowy: listy intencyjne z co najmniej 2 dostawcami TMS lub giełdami w regionie CEE jako podstawa licencji API od 2032 r. W 2030 r., pierwszym roku sprzedaży, sprzedaż trafia do klientów w Polsce, więc przychody poza RP w tym roku nie występują, o czym mówi wskaźnik w sekcji 8.2.</w:t>
       </w:r>
     </w:p>
     <w:p>
@@ -608,7 +608,7 @@
           <w:color w:val="666666"/>
           <w:sz w:val="17"/>
         </w:rPr>
-        <w:t xml:space="preserve"> [2603 znaków]</w:t>
+        <w:t xml:space="preserve"> [2699 znaków]</w:t>
       </w:r>
     </w:p>
     <w:p>
@@ -685,7 +685,7 @@
         <w:rPr>
           <w:b w:val="0"/>
         </w:rPr>
-        <w:t>Finansowanie i pomoc. Pakiet wystawcy rozbijamy na opłatę rejestracyjną z rezerwacją miejsca (pomoc de minimis, Przewodnik 5.3.8) oraz wynajem i obsługę stoiska (art. 19 GBER, 5.3.2). Zabudowa stoiska to art. 19 GBER (5.3.1). Podróże rozliczamy stawką jednostkową 5 489 zł na osobę dla Europy: na kongres jako art. 19 GBER (5.3.3), na misję jako de minimis (5.3.4). Doradztwo to art. 18 GBER (5.3.7). Wydatki internacjonalizacyjne Everest11 wynoszą ok. 2,1% jego kosztów prac B+R, a limit to 15%.</w:t>
+        <w:t>Finansowanie i pomoc. Pakiet wystawcy rozbijamy na opłatę rejestracyjną z rezerwacją miejsca (pomoc de minimis, Przewodnik 5.3.8) oraz wynajem i obsługę stoiska (art. 19 GBER, 5.3.2). Zabudowa stoiska to art. 19 GBER (5.3.1). Podróże rozliczamy stawką jednostkową 5 489 zł na osobę dla Europy: na kongres jako art. 19 GBER (5.3.3), na misję jako de minimis (5.3.4). Doradztwo to art. 18 GBER (5.3.7). Everest11 nie otrzymał pomocy de minimis w ostatnich trzech latach obrotowych (0 zł). Wydatki internacjonalizacyjne Everest11 wynoszą ok. 2,1% jego kosztów prac B+R, a limit to 15%.</w:t>
       </w:r>
     </w:p>
     <w:p>
@@ -696,7 +696,7 @@
         <w:rPr>
           <w:b w:val="0"/>
         </w:rPr>
-        <w:t>Rezultat i kamień milowy. Udział w kongresie jako wystawca, co najmniej 1 misja, co najmniej 5 rozmów z dostawcami TMS lub giełdami potwierdzonych notatkami ze spotkań, w tym co najmniej 2 z deklaracją gotowości do licencji API, oraz raport doradcy z modelem partnerstw. Weryfikacja: lista wystawców organizatora, dokumentacja zdjęciowa stoiska, notatki i raport doradcy.</w:t>
+        <w:t>Rezultat i kamień milowy. Udział w kongresie jako wystawca, co najmniej 1 misja, co najmniej 5 rozmów z dostawcami TMS lub giełdami potwierdzonych notatkami ze spotkań, w tym listy intencyjne z co najmniej 2 z nich dotyczące licencji API, oraz raport doradcy z modelem partnerstw. Weryfikacja: lista wystawców organizatora, dokumentacja zdjęciowa stoiska, notatki i raport doradcy.</w:t>
       </w:r>
     </w:p>
     <w:p>
@@ -1071,9 +1071,8 @@
               <w:rPr>
                 <w:b w:val="0"/>
                 <w:sz w:val="18"/>
-                <w:highlight w:val="yellow"/>
               </w:rPr>
-              <w:t>brutto</w:t>
+              <w:t>19 680,00</w:t>
             </w:r>
           </w:p>
         </w:tc>
@@ -1087,9 +1086,8 @@
               <w:rPr>
                 <w:b w:val="0"/>
                 <w:sz w:val="18"/>
-                <w:highlight w:val="yellow"/>
               </w:rPr>
-              <w:t>kwota z oferty organizatora</w:t>
+              <w:t>16 000,00</w:t>
             </w:r>
           </w:p>
         </w:tc>
@@ -1180,9 +1178,8 @@
               <w:rPr>
                 <w:b w:val="0"/>
                 <w:sz w:val="18"/>
-                <w:highlight w:val="yellow"/>
               </w:rPr>
-              <w:t>brutto</w:t>
+              <w:t>9 840,00</w:t>
             </w:r>
           </w:p>
         </w:tc>
@@ -1196,9 +1193,8 @@
               <w:rPr>
                 <w:b w:val="0"/>
                 <w:sz w:val="18"/>
-                <w:highlight w:val="yellow"/>
               </w:rPr>
-              <w:t>24 000 zł minus kwota pozycji 10-1</w:t>
+              <w:t>8 000,00</w:t>
             </w:r>
           </w:p>
         </w:tc>
@@ -2084,7 +2080,7 @@
         <w:rPr>
           <w:b w:val="0"/>
         </w:rPr>
-        <w:t>Pozycje 10-1 i 10-2 razem: 24 000,00 zł kwalifikowalnych i 29 520,00 zł ogółem, w podziale według oferty organizatora (ogółem to kwalifikowalne razy 1,23). Pozycje 10-4 i 10-5 wprowadzasz w pkt 3.2.5 jako koszty uproszczone, nie w 3.2.3.</w:t>
+        <w:t>Pozycje 10-4 i 10-5 wprowadzasz w pkt 3.2.5 jako koszty uproszczone, nie w 3.2.3. Pozycje 10-1 i 10-2 razem dają 24 000,00 zł kwalifikowalnych, czyli pakiet wystawcy.</w:t>
       </w:r>
     </w:p>
     <w:p>
@@ -2128,15 +2124,8 @@
       <w:r>
         <w:rPr>
           <w:b w:val="0"/>
-          <w:highlight w:val="yellow"/>
         </w:rPr>
-        <w:t>kwota z oferty organizatora</w:t>
-      </w:r>
-      <w:r>
-        <w:rPr>
-          <w:b w:val="0"/>
-        </w:rPr>
-        <w:t xml:space="preserve"> zł netto.</w:t>
+        <w:t>16 000,00 zł netto.</w:t>
       </w:r>
     </w:p>
     <w:p>
@@ -2156,7 +2145,7 @@
           <w:color w:val="666666"/>
           <w:sz w:val="17"/>
         </w:rPr>
-        <w:t xml:space="preserve"> [498 znaków]</w:t>
+        <w:t xml:space="preserve"> [597 znaków]</w:t>
       </w:r>
     </w:p>
     <w:p>
@@ -2167,7 +2156,7 @@
         <w:rPr>
           <w:b w:val="0"/>
         </w:rPr>
-        <w:t>Pozycja obejmuje opłatę rejestracyjną za udział dwóch delegatów w roli wystawcy, rezerwację miejsca wystawowego i wpis do katalogu kongresu TRANSLOG Connect Congress w Budapeszcie w listopadzie 2028 r. Wydarzenie jest podstawowym działaniem zadania Z10 i warunkiem wskaźnika liczby imprez, w których Everest11 uczestniczy jako wystawca. Koszt jest niezbędny, bo bez opłaty i rezerwacji nie ma udziału w kongresie ani spotkań B2B z dostawcami TMS. Jednostką jest jeden pakiet dla jednego wydarzenia.</w:t>
+        <w:t>Pozycja obejmuje opłatę rejestracyjną za udział dwóch delegatów w roli wystawcy, rezerwację miejsca wystawowego i spotkań oraz wpis do katalogu kongresu TRANSLOG Connect Congress w Budapeszcie w listopadzie 2028 r. Wydarzenie jest podstawowym działaniem zadania Z10 i warunkiem wskaźnika liczby imprez, w których Everest11 uczestniczy jako wystawca. Koszt jest niezbędny, bo bez opłaty i rezerwacji nie ma udziału w kongresie ani spotkań B2B z dostawcami TMS. Jednostką jest jeden pakiet dla jednego wydarzenia. Everest11 nie otrzymał pomocy de minimis w ostatnich trzech latach obrotowych (0 zł).</w:t>
       </w:r>
     </w:p>
     <w:p>
@@ -2187,7 +2176,7 @@
           <w:color w:val="666666"/>
           <w:sz w:val="17"/>
         </w:rPr>
-        <w:t xml:space="preserve"> [541 znaków]</w:t>
+        <w:t xml:space="preserve"> [584 znaków]</w:t>
       </w:r>
     </w:p>
     <w:p>
@@ -2198,33 +2187,7 @@
         <w:rPr>
           <w:b w:val="0"/>
         </w:rPr>
-        <w:t xml:space="preserve">Kwota pochodzi z oferty organizatora kongresu, TEG The Events Group, z dnia </w:t>
-      </w:r>
-      <w:r>
-        <w:rPr>
-          <w:b w:val="0"/>
-          <w:highlight w:val="yellow"/>
-        </w:rPr>
-        <w:t>data oferty</w:t>
-      </w:r>
-      <w:r>
-        <w:rPr>
-          <w:b w:val="0"/>
-        </w:rPr>
-        <w:t xml:space="preserve">, na pakiet wystawcy dla edycji 2028 (formularz zamówienia stoiska ze strony translogconnect.eu). Cennik stoisk nie jest publiczny, dlatego zapytanie skierowano bezpośrednio do organizatora, który jest jedynym dostawcą tej usługi. W ofercie opłata rejestracyjna, rezerwacja miejsca i katalog stanowią </w:t>
-      </w:r>
-      <w:r>
-        <w:rPr>
-          <w:b w:val="0"/>
-          <w:highlight w:val="yellow"/>
-        </w:rPr>
-        <w:t>kwota z oferty organizatora</w:t>
-      </w:r>
-      <w:r>
-        <w:rPr>
-          <w:b w:val="0"/>
-        </w:rPr>
-        <w:t xml:space="preserve"> zł netto, a wynajem i obsługa stoiska pozostała część pakietu, razem 24 000 zł netto. Kwoty w PLN, bez przeliczeń walutowych.</w:t>
+        <w:t>Organizator, TEG The Events Group, nie publikuje cennika i w korespondencji e-mail z 2026 r. odpowiedział, że ceny są porównywalne z cenami podobnych wydarzeń. Dlatego pakiet wystawcy dla dwóch delegatów oszacowano na 24 000 zł netto, a podział na składowe przyjęto według struktury oferty kongresu: miejsce spotkań z rezerwacją, rejestracja delegatów i wpis do katalogu stanowią 16 000 zł netto, czyli dwie trzecie pakietu, a wynajem i obsługa stoiska 8 000 zł netto (pozycja 10-2). Kwoty w PLN, bez przeliczeń walutowych. Korespondencja z organizatorem jest w dokumentacji projektu.</w:t>
       </w:r>
     </w:p>
     <w:p>
@@ -2257,15 +2220,8 @@
       <w:r>
         <w:rPr>
           <w:b w:val="0"/>
-          <w:highlight w:val="yellow"/>
         </w:rPr>
-        <w:t>24 000 zł minus kwota pozycji 10-1</w:t>
-      </w:r>
-      <w:r>
-        <w:rPr>
-          <w:b w:val="0"/>
-        </w:rPr>
-        <w:t xml:space="preserve"> zł netto.</w:t>
+        <w:t>8 000,00 zł netto.</w:t>
       </w:r>
     </w:p>
     <w:p>
@@ -2285,7 +2241,7 @@
           <w:color w:val="666666"/>
           <w:sz w:val="17"/>
         </w:rPr>
-        <w:t xml:space="preserve"> [380 znaków]</w:t>
+        <w:t xml:space="preserve"> [385 znaków]</w:t>
       </w:r>
     </w:p>
     <w:p>
@@ -2296,7 +2252,7 @@
         <w:rPr>
           <w:b w:val="0"/>
         </w:rPr>
-        <w:t>Pozycja obejmuje wynajem powierzchni i wyposażenia stoiska oraz jego obsługę techniczną w trakcie kongresu w Budapeszcie w 2028 r.: zasilanie, meble, ekspozycja prototypu. Stoisko jest miejscem prezentacji CargoDT dostawcom TMS i giełdom transportowym, a bez niego prezentacja prototypu z wynikami walidacji Z9 nie jest możliwa. Koszt dotyczy jednego stoiska i jednego wydarzenia.</w:t>
+        <w:t>Pozycja obejmuje wynajem wyposażenia stoiska i jego obsługę techniczną w trakcie kongresu w Budapeszcie w 2028 r.: zasilanie, meble, ekspozycja prototypu, obsługa organizatora. Stoisko jest miejscem prezentacji CargoDT dostawcom TMS i giełdom transportowym, a bez niego prezentacja prototypu z wynikami walidacji Z9 nie jest możliwa. Koszt dotyczy jednego stoiska i jednego wydarzenia.</w:t>
       </w:r>
     </w:p>
     <w:p>
@@ -2316,7 +2272,7 @@
           <w:color w:val="666666"/>
           <w:sz w:val="17"/>
         </w:rPr>
-        <w:t xml:space="preserve"> [335 znaków]</w:t>
+        <w:t xml:space="preserve"> [450 znaków]</w:t>
       </w:r>
     </w:p>
     <w:p>
@@ -2327,20 +2283,7 @@
         <w:rPr>
           <w:b w:val="0"/>
         </w:rPr>
-        <w:t xml:space="preserve">Kwota pochodzi z tej samej oferty organizatora kongresu z dnia </w:t>
-      </w:r>
-      <w:r>
-        <w:rPr>
-          <w:b w:val="0"/>
-          <w:highlight w:val="yellow"/>
-        </w:rPr>
-        <w:t>data oferty</w:t>
-      </w:r>
-      <w:r>
-        <w:rPr>
-          <w:b w:val="0"/>
-        </w:rPr>
-        <w:t>, część pakietu wystawcy dotycząca wynajmu i obsługi stoiska. Pozycje 10-1 i 10-2 razem dają 24 000 zł netto, czyli pełny pakiet wystawcy dla dwóch delegatów. Organizator nie publikuje cennika, więc źródłem jest oferta. Oferta pozostaje w dokumentacji projektu.</w:t>
+        <w:t>Kwota jest częścią pakietu wystawcy 24 000 zł netto opisanego w pozycji 10-1: 8 000 zł netto, czyli jedna trzecia pakietu przypadająca na wynajem i obsługę stoiska. Organizator nie publikuje cennika i potwierdził w korespondencji e-mail z 2026 r., że ceny są porównywalne z podobnymi wydarzeniami, więc podział jest oszacowaniem. Pozycje 10-1 i 10-2 razem nie przekraczają 24 000 zł netto. Korespondencja z organizatorem jest w dokumentacji projektu.</w:t>
       </w:r>
     </w:p>
     <w:p>
@@ -2586,7 +2529,7 @@
           <w:color w:val="666666"/>
           <w:sz w:val="17"/>
         </w:rPr>
-        <w:t xml:space="preserve"> [459 znaków]</w:t>
+        <w:t xml:space="preserve"> [545 znaków]</w:t>
       </w:r>
     </w:p>
     <w:p>
@@ -2597,7 +2540,7 @@
         <w:rPr>
           <w:b w:val="0"/>
         </w:rPr>
-        <w:t>Rzecznik patentowy wyda wstępne orzeczenie o zdolności patentowej wynalazku: metody i systemu predykcji ryzyka uszkodzenia ładunku z wielomodalnych sygnałów in-transit. Orzeczenie obejmuje przegląd stanu techniki w bazach patentowych i ocenę nowości oraz poziomu wynalazczego. Jest warunkiem decyzji o zgłoszeniu i niezbędne, bo Everest11 nie ma w zespole rzecznika. Koszt jest kwalifikowalny, jeśli orzeczenie jest pozytywne. Jednostką jest jedno orzeczenie.</w:t>
+        <w:t>Rzecznik patentowy wyda wstępne orzeczenie o zdolności patentowej wynalazku: metody i systemu predykcji ryzyka uszkodzenia ładunku z wielomodalnych sygnałów in-transit. Orzeczenie obejmuje przegląd stanu techniki w bazach patentowych i ocenę nowości oraz poziomu wynalazczego. Jest warunkiem decyzji o zgłoszeniu i niezbędne, bo Everest11 nie ma w zespole rzecznika. Koszt jest kwalifikowalny, jeśli orzeczenie jest pozytywne. Jednostką jest jedno orzeczenie. Everest11 nie otrzymał pomocy de minimis w ostatnich trzech latach obrotowych (0 zł).</w:t>
       </w:r>
     </w:p>
     <w:p>
@@ -2809,7 +2752,7 @@
           <w:color w:val="666666"/>
           <w:sz w:val="17"/>
         </w:rPr>
-        <w:t xml:space="preserve"> [452 znaków]</w:t>
+        <w:t xml:space="preserve"> [446 znaków]</w:t>
       </w:r>
     </w:p>
     <w:p>
@@ -2820,20 +2763,7 @@
         <w:rPr>
           <w:b w:val="0"/>
         </w:rPr>
-        <w:t xml:space="preserve">Źródło: taryfa opłat EPO obowiązująca od 1.04.2026 (Schedule of Fees, decyzja Rady Administracyjnej CA/D 9/25): opłata zgłoszeniowa online 135 EUR plus opłata za poszukiwanie europejskie 1 595 EUR, razem 1 730 EUR. Przeliczenie po kursie planistycznym 4,50 PLN/EUR daje 7 785 zł. Kurs planistyczny jest wyższy niż kurs średni NBP z dnia ogłoszenia naboru, 09.03.2026, który wynosił </w:t>
-      </w:r>
-      <w:r>
-        <w:rPr>
-          <w:b w:val="0"/>
-          <w:highlight w:val="yellow"/>
-        </w:rPr>
-        <w:t>kurs i numer tabeli NBP z 09.03.2026</w:t>
-      </w:r>
-      <w:r>
-        <w:rPr>
-          <w:b w:val="0"/>
-        </w:rPr>
-        <w:t>, i zawiera bufor na zmianę kursu.</w:t>
+        <w:t>Źródło: taryfa opłat EPO obowiązująca od 1.04.2026 (Schedule of Fees, decyzja Rady Administracyjnej CA/D 9/25): opłata zgłoszeniowa online 135 EUR plus opłata za poszukiwanie europejskie 1 595 EUR, razem 1 730 EUR. Kurs średni NBP z dnia ogłoszenia naboru, 09.03.2026, wynosił 4,2836 PLN/EUR, co daje 7 410,63 zł. Przyjęto kurs planistyczny 4,50 PLN/EUR, o 5% wyższy, co daje 7 785 zł i zawiera bufor na zmianę kursu do czasu poniesienia wydatku.</w:t>
       </w:r>
     </w:p>
     <w:p>
@@ -3551,7 +3481,7 @@
           <w:color w:val="666666"/>
           <w:sz w:val="17"/>
         </w:rPr>
-        <w:t xml:space="preserve"> [628 znaków]</w:t>
+        <w:t xml:space="preserve"> [714 znaków]</w:t>
       </w:r>
     </w:p>
     <w:p>
@@ -3562,7 +3492,7 @@
         <w:rPr>
           <w:b w:val="0"/>
         </w:rPr>
-        <w:t>Wyjazd na misję gospodarczą do Czech w 2029 r., przed końcem zadania Z10 (30.04.2029), służy spotkaniom z lokalnymi dostawcami TMS i partnerami licencyjnymi. Jedzie jedna osoba, specjalista ds. logistyki TSL, który prowadził wcześniejsze rozmowy z partnerami na kongresie i prowadzi rozmowy handlowe po stronie Lidera. Jedna osoba wystarcza, bo misja jest etapem kontynuacji kontaktów z kongresu i nie obejmuje stoiska ani prezentacji sprzętu. Liczba osób wynika z zadań, a nie z budżetu. Osoba jest zatrudniona w Everest11 i pracuje przy realizacji projektu. Stawka dla Europy to 5 489 zł na osobę na wyjazd (Przewodnik 5.3.4).</w:t>
+        <w:t>Wyjazd na misję gospodarczą do Czech w 2029 r., przed końcem zadania Z10 (30.04.2029), służy spotkaniom z lokalnymi dostawcami TMS i partnerami licencyjnymi. Jedzie jedna osoba, specjalista ds. logistyki TSL, który prowadził wcześniejsze rozmowy z partnerami na kongresie i prowadzi rozmowy handlowe po stronie Lidera. Jedna osoba wystarcza, bo misja jest etapem kontynuacji kontaktów z kongresu i nie obejmuje stoiska ani prezentacji sprzętu. Liczba osób wynika z zadań, a nie z budżetu. Osoba jest zatrudniona w Everest11 i pracuje przy realizacji projektu. Stawka dla Europy to 5 489 zł na osobę na wyjazd (Przewodnik 5.3.4). Everest11 nie otrzymał pomocy de minimis w ostatnich trzech latach obrotowych (0 zł).</w:t>
       </w:r>
     </w:p>
     <w:p>
@@ -3821,7 +3751,7 @@
         <w:rPr>
           <w:b w:val="0"/>
         </w:rPr>
-        <w:t>Obecny wskaźnik ma wartość 489 300 zł, czyli cały przychód 2030 r. z klientów w Polsce, a nie przychód poza RP. W modelu ekspansja CEE zaczyna się później, więc wartość nie ma pokrycia. Rok 2030 jest właściwy, bo to rok po zakończeniu projektu w kwietniu 2029 r. Sprawdź w LSI, że w tym polu jest 2030.</w:t>
+        <w:t>Obecny wskaźnik ma wartość 489 300 zł, czyli cały przychód 2030 r. od klientów w Polsce, a nie przychód poza RP. Ustaliłaś, że w pierwszym roku nie będzie licencji za granicą, więc wartość to 0 zł. Rok 2030 jest właściwy, bo to rok po zakończeniu projektu w kwietniu 2029 r. Sprawdź w LSI, że w polu jest 2030. Ryzyko: zero przy obligatoryjnym wskaźniku internacjonalizacji ekspert może skomentować, dlatego metodologia wyjaśnia, że 2030 to start sprzedaży w Polsce, a przychody zagraniczne zaczynają się w 2032-2033 r. według modelu i pkt 2.1.</w:t>
       </w:r>
     </w:p>
     <w:tbl>
@@ -4053,7 +3983,7 @@
                 <w:b w:val="0"/>
                 <w:sz w:val="18"/>
               </w:rPr>
-              <w:t>9600</w:t>
+              <w:t>0</w:t>
             </w:r>
           </w:p>
         </w:tc>
@@ -4077,7 +4007,7 @@
           <w:color w:val="666666"/>
           <w:sz w:val="17"/>
         </w:rPr>
-        <w:t xml:space="preserve"> [571 znaków]</w:t>
+        <w:t xml:space="preserve"> [677 znaków]</w:t>
       </w:r>
     </w:p>
     <w:p>
@@ -4088,7 +4018,7 @@
         <w:rPr>
           <w:b w:val="0"/>
         </w:rPr>
-        <w:t>Wartość docelowa 9 600 zł to przychody ze sprzedaży poza terytorium RP w 2030 r., czyli w roku po zakończeniu projektu w kwietniu 2029 r. Składają się na nią 2 umowy licencji API z dostawcami TMS lub giełdami transportowymi w regionie CEE, pozyskanymi w zadaniu Z10, po 4 800 zł za umowę rocznie, zgodnie z cennikiem i modelem finansowym. Subskrypcje SaaS i zestawy sprzedane klientom w Polsce nie wchodzą do wskaźnika, nawet jeśli pojazdy jeżdżą za granicą. Sprzedaż komercyjna rusza w styczniu 2030 r. Przychody osiąga wyłącznie Everest11, a PRz nie prowadzi sprzedaży.</w:t>
+        <w:t>Rokiem osiągnięcia wartości docelowej jest 2030, czyli rok po zakończeniu projektu w kwietniu 2029 r. W 2030 r. następuje start sprzedaży komercyjnej, a nabywcami są klienci w Polsce: operatorzy objęci listami intencyjnymi na 50 pojazdów. Przychody poza terytorium RP w tym roku nie wystąpią, więc wartość docelowa wynosi 0 zł. Pierwsze przychody ze sprzedaży poza RP wynikają z modelu finansowego od 2032-2033 r., z licencji API dla dostawców TMS w regionie CEE pozyskanych w zadaniu Z10, po 4 800 zł za umowę rocznie. Subskrypcje SaaS i zestawy sprzedane klientom w Polsce nie wchodzą do wskaźnika, nawet jeśli pojazdy jeżdżą za granicą. Wskaźnik dotyczy wyłącznie Everest11.</w:t>
       </w:r>
     </w:p>
     <w:p>
@@ -4108,7 +4038,7 @@
           <w:color w:val="666666"/>
           <w:sz w:val="17"/>
         </w:rPr>
-        <w:t xml:space="preserve"> [183 znaków]</w:t>
+        <w:t xml:space="preserve"> [214 znaków]</w:t>
       </w:r>
     </w:p>
     <w:p>
@@ -4119,7 +4049,7 @@
         <w:rPr>
           <w:b w:val="0"/>
         </w:rPr>
-        <w:t>Umowy licencji API z podmiotami zagranicznymi, faktury sprzedaży, sprawozdanie finansowe Everest11 za 2030 r. z wyodrębnionym przychodem z licencji CargoDT w podziale na kraj nabywcy.</w:t>
+        <w:t>Sprawozdanie finansowe Everest11 za 2030 r. z przychodami CargoDT w podziale na kraj nabywcy, rejestr umów i faktur sprzedaży z danymi nabywców. Wartość 0 potwierdza brak faktur dla nabywców zagranicznych w 2030 r.</w:t>
       </w:r>
     </w:p>
     <w:p>
@@ -4155,30 +4085,13 @@
         <w:rPr>
           <w:b/>
         </w:rPr>
-        <w:t>Model finansowy, komentarz w arkuszu Przychody:</w:t>
+        <w:t>Model finansowy i pkt 2.1:</w:t>
       </w:r>
       <w:r>
         <w:rPr>
           <w:b w:val="0"/>
         </w:rPr>
-        <w:t xml:space="preserve"> „ekspansja CEE od 2033 r.” zmień na: „pierwsze 2 licencje API w 2030 r. dla partnerów w regionie CEE, szersza ekspansja od 2032 r.”. Liczby w modelu bez zmian, bo 2 licencje API w 2030 r. są już w modelu (9 600 zł).</w:t>
-      </w:r>
-    </w:p>
-    <w:p>
-      <w:pPr>
-        <w:pStyle w:val="ListBullet"/>
-      </w:pPr>
-      <w:r>
-        <w:rPr>
-          <w:b/>
-        </w:rPr>
-        <w:t>Pkt 2.1 Segment 3 i 2.3:</w:t>
-      </w:r>
-      <w:r>
-        <w:rPr>
-          <w:b w:val="0"/>
-        </w:rPr>
-        <w:t xml:space="preserve"> zdanie o operatorach CEE przez licencje API od 2032-2033 uzupełnij o pierwsze 2 licencje w 2030 r. Teksty R23 i P23 z pliku Sekcja_1.3_i_ceny.docx nie podają dat CEE, więc nie wymagają zmiany.</w:t>
+        <w:t xml:space="preserve"> bez zmian. Model ma ekspansję CEE od 2032-2033 r., a wskaźnik przychodów poza RP w 2030 r. wynosi 0 zł, więc teksty są spójne. W pkt 2.1 i modelu nie dopisuj licencji CEE w 2030 r.</w:t>
       </w:r>
     </w:p>
     <w:p>
@@ -4254,7 +4167,7 @@
         <w:pStyle w:val="Heading1"/>
       </w:pPr>
       <w:r>
-        <w:t>8. Do uzupełnienia i potwierdzenia</w:t>
+        <w:t>8. Zadania po Twojej stronie</w:t>
       </w:r>
     </w:p>
     <w:tbl>
@@ -4342,7 +4255,7 @@
                 <w:b w:val="0"/>
                 <w:sz w:val="18"/>
               </w:rPr>
-              <w:t>Oferta organizatora TRANSLOG (TEG The Events Group) na pakiet wystawcy 2028: data oferty i podział 24 000 zł na (a) opłatę rejestracyjną, rezerwację miejsca i katalog oraz (b) wynajem i obsługę stoiska. Cennik nie jest publiczny, więc potrzebny jest formularz „Stand Request Form” ze strony translogconnect.eu. Wpisz kwoty w pozycjach 10-1 i 10-2. Jeśli organizator nie poda podziału przed 06.10.2026, zostaw jedną pozycję 24 000 zł z kategorią 5.3.2 (art. 19), z zastrzeżeniem, że organizator nie publikuje rozbicia, i napisz mi, a przygotuję wariant tekstu.</w:t>
+              <w:t>Zachowaj korespondencję e-mail z organizatorem TRANSLOG (TEG The Events Group), w której pisze, że ceny są porównywalne z podobnymi wydarzeniami. Tekst pozycji 10-1 i 10-2 się na nią powołuje, a ekspert może zapytać o źródło szacunku. Jeśli odpowiedź organizatora zawiera jakąkolwiek kwotę, napisz mi, to dopasuję podział.</w:t>
             </w:r>
           </w:p>
         </w:tc>
@@ -4357,7 +4270,7 @@
                 <w:b w:val="0"/>
                 <w:sz w:val="18"/>
               </w:rPr>
-              <w:t>Ty, kontakt z organizatorem</w:t>
+              <w:t>Ty</w:t>
             </w:r>
           </w:p>
         </w:tc>
@@ -4389,7 +4302,7 @@
                 <w:b w:val="0"/>
                 <w:sz w:val="18"/>
               </w:rPr>
-              <w:t>Kurs średni NBP EUR z 09.03.2026 (dzień ogłoszenia naboru wg Regulaminu) i numer tabeli, do pozycji 11-3. Strona nbp.pl, archiwum kursów, tabela A.</w:t>
+              <w:t>Umowa o wykonywaniu wspólnych praw z PRz (§ 11 ust. 5), zawarta przed rozpoczęciem Z11 (przed 11.2028), z upoważnieniem Everest11 do zgłoszenia w EPO, podziałem wynalazców i kosztów. Tekst Z11 zakłada takie postanowienie.</w:t>
             </w:r>
           </w:p>
         </w:tc>
@@ -4404,7 +4317,7 @@
                 <w:b w:val="0"/>
                 <w:sz w:val="18"/>
               </w:rPr>
-              <w:t>Ty</w:t>
+              <w:t>Ty, PRz</w:t>
             </w:r>
           </w:p>
         </w:tc>
@@ -4436,7 +4349,7 @@
                 <w:b w:val="0"/>
                 <w:sz w:val="18"/>
               </w:rPr>
-              <w:t>Decyzja D40: wskaźnik przychodów poza RP = 9 600 zł (2 licencje API dla partnerów CEE w 2030 r.). Alternatywa: 0 zł, ale wskaźnik obligatoryjny przy kosztach internacjonalizacji z zerem osłabia uzasadnienie Z10, więc zalecam 9 600 zł. Ryzyko: wskaźnik jest monitorowany, więc 2 licencje trzeba zawrzeć w 2030 r.</w:t>
+              <w:t>Wniosek o zmianę wpisu PKD w KRS do 31.03.2027 (kody 62.10.B i 63.10.D). Termin jest zobowiązaniem z tekstu 3.2.1.</w:t>
             </w:r>
           </w:p>
         </w:tc>
@@ -4451,7 +4364,7 @@
                 <w:b w:val="0"/>
                 <w:sz w:val="18"/>
               </w:rPr>
-              <w:t>Ty</w:t>
+              <w:t>Zarząd Everest11</w:t>
             </w:r>
           </w:p>
         </w:tc>
@@ -4483,54 +4396,7 @@
                 <w:b w:val="0"/>
                 <w:sz w:val="18"/>
               </w:rPr>
-              <w:t>Umowa o wykonywaniu wspólnych praw (§ 11 ust. 5): do zawarcia z PRz przed rozpoczęciem Z11 (przed 11.2028), z upoważnieniem Everest11 do zgłoszenia w EPO, podziałem wynalazców i kosztów. Tekst Z11 zakłada, że takie postanowienie będzie. Sprawdź ust. 5 w umowie konsorcjum i potwierdź z PRz.</w:t>
-            </w:r>
-          </w:p>
-        </w:tc>
-        <w:tc>
-          <w:tcPr>
-            <w:tcW w:type="dxa" w:w="2268"/>
-          </w:tcPr>
-          <w:p>
-            <w:r/>
-            <w:r>
-              <w:rPr>
-                <w:b w:val="0"/>
-                <w:sz w:val="18"/>
-              </w:rPr>
-              <w:t>Ty, PRz</w:t>
-            </w:r>
-          </w:p>
-        </w:tc>
-      </w:tr>
-      <w:tr>
-        <w:tc>
-          <w:tcPr>
-            <w:tcW w:type="dxa" w:w="567"/>
-          </w:tcPr>
-          <w:p>
-            <w:r/>
-            <w:r>
-              <w:rPr>
-                <w:b w:val="0"/>
-                <w:sz w:val="18"/>
-              </w:rPr>
-              <w:t>5</w:t>
-            </w:r>
-          </w:p>
-        </w:tc>
-        <w:tc>
-          <w:tcPr>
-            <w:tcW w:type="dxa" w:w="6917"/>
-          </w:tcPr>
-          <w:p>
-            <w:r/>
-            <w:r>
-              <w:rPr>
-                <w:b w:val="0"/>
-                <w:sz w:val="18"/>
-              </w:rPr>
-              <w:t>De minimis: pozycje 10-1, 10-5 i 11-1 to pomoc de minimis (rozporządzenie 2023/2831). Everest11 musi sprawdzić pomoc de minimis z trzech ostatnich lat obrotowych (limit 300 000 EUR na przedsiębiorstwo) i złożyć wymagane oświadczenia. Pomoc de minimis w tym projekcie to połowa kwot z pozycji 10-1, 10-5 i 11-1, czyli kilkanaście tysięcy złotych, ale wcześniejsza pomoc może zmienić bilans.</w:t>
+              <w:t>Oświadczenie o pomocy de minimis: Everest11 nie otrzymał jej w ostatnich trzech latach obrotowych (0 zł), co jest zapisane w uzasadnieniach pozycji 10-1, 10-5 i 11-1. Przygotuj oświadczenie i formularz de minimis zgodnie z wymaganiami naboru.</w:t>
             </w:r>
           </w:p>
         </w:tc>
@@ -4546,147 +4412,6 @@
                 <w:sz w:val="18"/>
               </w:rPr>
               <w:t>Everest11, księgowość</w:t>
-            </w:r>
-          </w:p>
-        </w:tc>
-      </w:tr>
-      <w:tr>
-        <w:tc>
-          <w:tcPr>
-            <w:tcW w:type="dxa" w:w="567"/>
-          </w:tcPr>
-          <w:p>
-            <w:r/>
-            <w:r>
-              <w:rPr>
-                <w:b w:val="0"/>
-                <w:sz w:val="18"/>
-              </w:rPr>
-              <w:t>6</w:t>
-            </w:r>
-          </w:p>
-        </w:tc>
-        <w:tc>
-          <w:tcPr>
-            <w:tcW w:type="dxa" w:w="6917"/>
-          </w:tcPr>
-          <w:p>
-            <w:r/>
-            <w:r>
-              <w:rPr>
-                <w:b w:val="0"/>
-                <w:sz w:val="18"/>
-              </w:rPr>
-              <w:t>PKD: wniosek o zmianę wpisu w KRS do 31.03.2027 (kody 62.10.B i 63.10.D). Termin to zobowiązanie, przeczytaj tekst 3.2.1.</w:t>
-            </w:r>
-          </w:p>
-        </w:tc>
-        <w:tc>
-          <w:tcPr>
-            <w:tcW w:type="dxa" w:w="2268"/>
-          </w:tcPr>
-          <w:p>
-            <w:r/>
-            <w:r>
-              <w:rPr>
-                <w:b w:val="0"/>
-                <w:sz w:val="18"/>
-              </w:rPr>
-              <w:t>Zarząd Everest11</w:t>
-            </w:r>
-          </w:p>
-        </w:tc>
-      </w:tr>
-      <w:tr>
-        <w:tc>
-          <w:tcPr>
-            <w:tcW w:type="dxa" w:w="567"/>
-          </w:tcPr>
-          <w:p>
-            <w:r/>
-            <w:r>
-              <w:rPr>
-                <w:b w:val="0"/>
-                <w:sz w:val="18"/>
-              </w:rPr>
-              <w:t>7</w:t>
-            </w:r>
-          </w:p>
-        </w:tc>
-        <w:tc>
-          <w:tcPr>
-            <w:tcW w:type="dxa" w:w="6917"/>
-          </w:tcPr>
-          <w:p>
-            <w:r/>
-            <w:r>
-              <w:rPr>
-                <w:b w:val="0"/>
-                <w:sz w:val="18"/>
-              </w:rPr>
-              <w:t>Dwie osoby na kongres (kierownik zarządzający i specjalista ds. logistyki TSL) i jedna na misję (specjalista ds. logistyki TSL). Potwierdź, że to właściwe osoby i że zgadzasz się z podziałem ról.</w:t>
-            </w:r>
-          </w:p>
-        </w:tc>
-        <w:tc>
-          <w:tcPr>
-            <w:tcW w:type="dxa" w:w="2268"/>
-          </w:tcPr>
-          <w:p>
-            <w:r/>
-            <w:r>
-              <w:rPr>
-                <w:b w:val="0"/>
-                <w:sz w:val="18"/>
-              </w:rPr>
-              <w:t>Ty</w:t>
-            </w:r>
-          </w:p>
-        </w:tc>
-      </w:tr>
-      <w:tr>
-        <w:tc>
-          <w:tcPr>
-            <w:tcW w:type="dxa" w:w="567"/>
-          </w:tcPr>
-          <w:p>
-            <w:r/>
-            <w:r>
-              <w:rPr>
-                <w:b w:val="0"/>
-                <w:sz w:val="18"/>
-              </w:rPr>
-              <w:t>8</w:t>
-            </w:r>
-          </w:p>
-        </w:tc>
-        <w:tc>
-          <w:tcPr>
-            <w:tcW w:type="dxa" w:w="6917"/>
-          </w:tcPr>
-          <w:p>
-            <w:r/>
-            <w:r>
-              <w:rPr>
-                <w:b w:val="0"/>
-                <w:sz w:val="18"/>
-              </w:rPr>
-              <w:t>Doradztwo skrócone z 16 do 13 dni (16 000 do 13 000 zł), żeby przy stawkach jednostkowych podróży suma internacjonalizacji nie wzrosła. Alternatywa: zrezygnować z wyjazdu na misję i zostawić 16 000 zł. Odpowiedz, jeśli wolisz alternatywę.</w:t>
-            </w:r>
-          </w:p>
-        </w:tc>
-        <w:tc>
-          <w:tcPr>
-            <w:tcW w:type="dxa" w:w="2268"/>
-          </w:tcPr>
-          <w:p>
-            <w:r/>
-            <w:r>
-              <w:rPr>
-                <w:b w:val="0"/>
-                <w:sz w:val="18"/>
-              </w:rPr>
-              <w:t>Ty</w:t>
             </w:r>
           </w:p>
         </w:tc>
@@ -4942,7 +4667,7 @@
                 <w:b w:val="0"/>
                 <w:sz w:val="18"/>
               </w:rPr>
-              <w:t>Do wpisania kurs NBP</w:t>
+              <w:t>Gotowe</w:t>
             </w:r>
           </w:p>
         </w:tc>
@@ -5130,7 +4855,7 @@
                 <w:b w:val="0"/>
                 <w:sz w:val="18"/>
               </w:rPr>
-              <w:t>Do wpisania kwoty z oferty organizatora</w:t>
+              <w:t>Gotowe, podział jest oszacowaniem</w:t>
             </w:r>
           </w:p>
         </w:tc>
@@ -5271,7 +4996,7 @@
                 <w:b w:val="0"/>
                 <w:sz w:val="18"/>
               </w:rPr>
-              <w:t>Gotowe po decyzji D40</w:t>
+              <w:t>Gotowe, wartość 0 zł</w:t>
             </w:r>
           </w:p>
         </w:tc>

</xml_diff>

<commit_message>
WP09: cennik historyczny TRANSLOG (13 783 + 10 217), czas przyszły, doradztwo wg wzoru, scalone 5.3.10, bez de minimis w tekstach, sprawdzenie z Instrukcją
Co-Authored-By: Claude Sonnet 5.5 <noreply@anthropic.com>
Claude-Session: https://claude.ai/code/session_01672WnJhixnEcarbb7uiwfx
</commit_message>
<xml_diff>
--- a/Sekcja_3.2_internacjonalizacja_Z10_Z11.docx
+++ b/Sekcja_3.2_internacjonalizacja_Z10_Z11.docx
@@ -255,7 +255,7 @@
                 <w:b w:val="0"/>
                 <w:sz w:val="18"/>
               </w:rPr>
-              <w:t>Pakiet 24 000 zł rozdzielony na rezerwację i rejestrację (de minimis, 5.3.8) oraz wynajem i obsługę stoiska (art. 19, 5.3.2). Organizator nie publikuje cennika, więc podział (16 000 zł i 8 000 zł) jest oszacowaniem według struktury oferty, z odwołaniem do korespondencji e-mail z organizatorem.</w:t>
+              <w:t>Pakiet 24 000 zł rozdzielony na powierzchnię i opłatę podstawową (de minimis, 5.3.8: 13 783 zł) oraz energię, zabudowę i meble (art. 19, 5.3.2: 10 217 zł). Podział i kwoty wynikają z cennika historycznego kongresu (stoisko narożne 9 m², górne granice zakresów, kurs NBP 4,2836, waloryzacja ok. 10,4%).</w:t>
             </w:r>
           </w:p>
         </w:tc>
@@ -319,7 +319,7 @@
                 <w:b w:val="0"/>
                 <w:sz w:val="18"/>
               </w:rPr>
-              <w:t>Rzecznik: orzeczenie o zdolności patentowej (8 000 zł, de minimis, 5.3.11) oddzielone od dokumentacji i zgłoszenia (12 000 zł, art. 28). Razem 20 000 zł, czyli górna granica oferty 16 000 do 20 000 zł, bez przekroczenia. Brak dublowania z Z9 (usunięte w K3-40).</w:t>
+              <w:t>Rzecznik: orzeczenie o zdolności patentowej (8 000 zł, de minimis, 5.3.11) oddzielone od dokumentacji, zgłoszenia i tłumaczeń (15 500 zł, art. 28, jedna pozycja). Usługi rzecznika bez tłumaczeń to 20 000 zł, czyli górna granica oferty 16 000 do 20 000 zł, bez przekroczenia. Brak dublowania z Z9 (usunięte w K3-40).</w:t>
             </w:r>
           </w:p>
         </w:tc>
@@ -423,7 +423,7 @@
           <w:color w:val="666666"/>
           <w:sz w:val="17"/>
         </w:rPr>
-        <w:t xml:space="preserve"> [1957 znaków]</w:t>
+        <w:t xml:space="preserve"> [1992 znaków]</w:t>
       </w:r>
     </w:p>
     <w:p>
@@ -434,7 +434,7 @@
         <w:rPr>
           <w:b w:val="0"/>
         </w:rPr>
-        <w:t>Tak. CargoDT jest wytwarzany w Polsce przez osoby zatrudnione w Polsce, co spełnia warunek nr 2 z Instrukcji.</w:t>
+        <w:t>Tak. CargoDT będzie wytwarzany w Polsce przez osoby zatrudnione w Polsce, co spełnia warunek nr 2 z Instrukcji.</w:t>
       </w:r>
     </w:p>
     <w:p>
@@ -445,7 +445,7 @@
         <w:rPr>
           <w:b w:val="0"/>
         </w:rPr>
-        <w:t>Oprogramowanie. Modele AI, pipeline inferencyjny na platformie embedded, generator dokumentów PoL i PoC, integracje eFTI i e-CMR, API oraz platformę SaaS opracowują i utrzymują pracownicy Everest11: zespół AI, IT i cyberbezpieczeństwa.</w:t>
+        <w:t>Oprogramowanie. Modele AI, pipeline inferencyjny na platformie embedded, generator dokumentów PoL i PoC, integracje eFTI i e-CMR, API oraz platformę SaaS będą opracowywać i utrzymywać pracownicy Everest11: zespół AI, IT i cyberbezpieczeństwa.</w:t>
       </w:r>
     </w:p>
     <w:p>
@@ -456,7 +456,7 @@
         <w:rPr>
           <w:b w:val="0"/>
         </w:rPr>
-        <w:t>Część sprzętowa. Nie produkujemy komponentów elektronicznych. Kamery, radar, platformę obliczeniową, zasilanie i obudowy kupujemy jako gotowe produkty komercyjne. Zestaw powstaje w Polsce w trzech krokach, wszystkie wykonują pracownicy Everest11. 1) Integracja i konfiguracja: oprogramowanie sterujące, kalibracja kamer i radaru. 2) Kompletacja: montaż kupionych komponentów w zestaw i test odbiorczy. 3) Instalacja w naczepie klienta, uruchomienie i serwis. Kompletację i montaż prowadzi IoT Specialist, od 2033 r. z kolejnymi technikami. Pierwszą serię zestawów, 50 sztuk w 2029 r., kompletujemy własnym zespołem w małej serii. Kompletacja pozostaje w Everest11 także przy większych seriach po 2031 r., w wynajętej powierzchni magazynowo-montażowej w Polsce. W samym projekcie montaż prototypów w Z2 i Z9 wykonuje podwykonawca pod nadzorem IoT Specialist, ale dotyczy to egzemplarzy badawczych, a nie wytwarzania produktu handlowego.</w:t>
+        <w:t>Część sprzętowa. Everest11 nie będzie produkować komponentów elektronicznych. Kamery, radar, platformę obliczeniową, zasilanie i obudowy kupi jako gotowe produkty komercyjne. Zestaw będzie powstawał w Polsce w trzech krokach, a wszystkie wykonają pracownicy Everest11. 1) Integracja i konfiguracja: oprogramowanie sterujące, kalibracja kamer i radaru. 2) Kompletacja: montaż kupionych komponentów w zestaw i test odbiorczy. 3) Instalacja w naczepie klienta, uruchomienie i serwis. Kompletację i montaż będzie prowadzić IoT Specialist, od 2033 r. z kolejnymi technikami. Pierwszą serię zestawów, 50 sztuk w 2029 r., Everest11 skompletuje własnym zespołem w małej serii. Kompletacja pozostanie w Everest11 także przy większych seriach po 2031 r., w wynajętej powierzchni magazynowo-montażowej w Polsce. W samym projekcie montaż prototypów w Z2 i Z9 wykona podwykonawca pod nadzorem IoT Specialist, ale dotyczy to egzemplarzy badawczych, a nie wytwarzania produktu handlowego.</w:t>
       </w:r>
     </w:p>
     <w:p>
@@ -467,7 +467,7 @@
         <w:rPr>
           <w:b w:val="0"/>
         </w:rPr>
-        <w:t>Usługa. Subskrypcję SaaS i wsparcie techniczne świadczy zespół Everest11 w Polsce. Platforma działa w chmurze, a obsługują ją pracownicy zatrudnieni w Polsce, co odpowiada wymogowi dla usług zdalnych i automatycznych.</w:t>
+        <w:t>Usługa. Subskrypcję SaaS i wsparcie techniczne będzie świadczył zespół Everest11 w Polsce. Platforma będzie działać w chmurze, obsługiwana przez pracowników zatrudnionych w Polsce (usługa zdalna).</w:t>
       </w:r>
     </w:p>
     <w:p>
@@ -478,7 +478,7 @@
         <w:rPr>
           <w:b w:val="0"/>
         </w:rPr>
-        <w:t>PKD. W dniu złożenia wniosku w KRS Everest11 nie ma kodu PKD dla działalności produktowej, bo zostanie ona uruchomiona w wyniku projektu. Planowane kody według PKD 2025 (rozporządzenie Rady Ministrów z 18.12.2024, Dz.U. 2024 poz. 1936): 62.10.B Pozostała działalność w zakresie programowania oraz 63.10.D, usługi infrastruktury obliczeniowej i przetwarzania danych. Wniosek o zmianę wpisu złożymy do 31.03.2027, czyli przed sprzedażą pierwszych egzemplarzy.</w:t>
+        <w:t>PKD. W dniu złożenia wniosku w KRS Everest11 nie ma kodu PKD dla działalności produktowej, bo zostanie ona uruchomiona w wyniku projektu. Planowane kody według PKD 2025 (rozporządzenie Rady Ministrów z 18.12.2024, Dz.U. 2024 poz. 1936): 62.10.B Pozostała działalność w zakresie programowania oraz 63.10.D, usługi infrastruktury obliczeniowej i przetwarzania danych. Wniosek o zmianę wpisu zostanie złożony do 31.03.2027, czyli przed sprzedażą pierwszych egzemplarzy.</w:t>
       </w:r>
     </w:p>
     <w:p>
@@ -506,7 +506,7 @@
           <w:color w:val="666666"/>
           <w:sz w:val="17"/>
         </w:rPr>
-        <w:t xml:space="preserve"> [1825 znaków]</w:t>
+        <w:t xml:space="preserve"> [1844 znaków]</w:t>
       </w:r>
     </w:p>
     <w:p>
@@ -517,7 +517,7 @@
         <w:rPr>
           <w:b w:val="0"/>
         </w:rPr>
-        <w:t>Rynkiem docelowym CargoDT jest Polska, a promocja zagraniczna dotyczy Czech, Słowacji, Węgier i Rumunii. Wybraliśmy je z trzech powodów.</w:t>
+        <w:t>Rynkiem docelowym CargoDT będzie Polska, a promocja zagraniczna obejmie Czechy, Słowację, Węgry i Rumunię. Wybór wynika z trzech powodów.</w:t>
       </w:r>
     </w:p>
     <w:p>
@@ -539,7 +539,7 @@
         <w:rPr>
           <w:b w:val="0"/>
         </w:rPr>
-        <w:t>Po drugie, rozporządzenie eFTI (UE) 2020/1056 obowiązuje w całej Unii. Od 21.08.2025 organy państw członkowskich muszą przyjmować dane przewozowe w formacie eFTI, a przewoźnicy mogą z tej drogi korzystać dobrowolnie. Dokument Proof of Condition w formacie eFTI działa więc w każdym z tych krajów bez zmian.</w:t>
+        <w:t>Po drugie, rozporządzenie eFTI (UE) 2020/1056 obowiązuje w całej Unii. Od 21.08.2025 organy państw członkowskich muszą przyjmować dane przewozowe w formacie eFTI, a przewoźnicy mogą z tej drogi korzystać dobrowolnie. Dokument Proof of Condition w formacie eFTI będzie więc działał w każdym z tych krajów bez zmian.</w:t>
       </w:r>
     </w:p>
     <w:p>
@@ -550,7 +550,7 @@
         <w:rPr>
           <w:b w:val="0"/>
         </w:rPr>
-        <w:t>Po trzecie, CargoDT wchodzi na te rynki bez lokalnej obecności: przez licencje API dla lokalnych dostawców TMS i przez giełdy transportowe, z którymi Everest11 jest już zintegrowane, czyli Trans.eu i TimoCom. Konkurencyjne oferty to rozwiązania fabryczne w nowych naczepach i systemy aftermarket bez modelu 3D przestrzeni ładunkowej (pkt 1.2), więc retrofit dla MŚP w subskrypcji jest ofertą uzupełniającą.</w:t>
+        <w:t>Po trzecie, CargoDT wejdzie na te rynki bez lokalnej obecności: przez licencje API dla lokalnych dostawców TMS i przez giełdy transportowe, z którymi Everest11 jest już zintegrowane, czyli Trans.eu i TimoCom. Konkurencyjne oferty to rozwiązania fabryczne w nowych naczepach i systemy aftermarket bez modelu 3D przestrzeni ładunkowej (pkt 1.2), więc retrofit dla MŚP w subskrypcji będzie ofertą uzupełniającą.</w:t>
       </w:r>
     </w:p>
     <w:p>
@@ -561,7 +561,7 @@
         <w:rPr>
           <w:b w:val="0"/>
         </w:rPr>
-        <w:t>Sposób promocji. Podstawowym działaniem jest udział Everest11 w TRANSLOG Connect Congress w Budapeszcie w listopadzie 2028 r. To coroczny kongres branży TSL w Europie Środkowo-Wschodniej, na którym wystawcy prowadzą spotkania B2B z dostawcami oprogramowania i logistyki. Uzupełniają go: jedna wyjazdowa misja gospodarcza do Czech w 2029 r., na której spotkamy się z lokalnymi dostawcami TMS, oraz usługi doradcze: analiza rynków, model partnerstw i licencji API. Misja i doradztwo nie są jedynymi działaniami, bo kongres jest wydarzeniem wiodącym.</w:t>
+        <w:t>Sposób promocji. Podstawowym działaniem będzie udział Everest11 w TRANSLOG Connect Congress w Budapeszcie w listopadzie 2028 r. To coroczny kongres branży TSL w Europie Środkowo-Wschodniej, na którym wystawcy prowadzą spotkania B2B z dostawcami oprogramowania i logistyki. Uzupełnią go: jedna wyjazdowa misja gospodarcza do Czech w 2029 r., na której Everest11 spotka się z lokalnymi dostawcami TMS, oraz usługi doradcze: analiza rynków, model partnerstw i licencji API. Misja i doradztwo nie będą jedynymi działaniami, bo kongres jest wydarzeniem wiodącym.</w:t>
       </w:r>
     </w:p>
     <w:p>
@@ -572,7 +572,7 @@
         <w:rPr>
           <w:b w:val="0"/>
         </w:rPr>
-        <w:t>Cel handlowy: listy intencyjne z co najmniej 2 dostawcami TMS lub giełdami w regionie CEE jako podstawa licencji API od 2032 r. W 2030 r., pierwszym roku sprzedaży, sprzedaż trafia do klientów w Polsce, więc przychody poza RP w tym roku nie występują, o czym mówi wskaźnik w sekcji 8.2.</w:t>
+        <w:t>Cel handlowy: listy intencyjne z co najmniej 2 dostawcami TMS lub giełdami w regionie CEE jako podstawa licencji API od 2032 r. W 2030 r., pierwszym roku sprzedaży, sprzedaż trafi do klientów w Polsce, więc przychody poza RP w tym roku nie wystąpią, o czym mówi wskaźnik w sekcji 8.2.</w:t>
       </w:r>
     </w:p>
     <w:p>
@@ -608,7 +608,7 @@
           <w:color w:val="666666"/>
           <w:sz w:val="17"/>
         </w:rPr>
-        <w:t xml:space="preserve"> [2699 znaków]</w:t>
+        <w:t xml:space="preserve"> [2704 znaków]</w:t>
       </w:r>
     </w:p>
     <w:p>
@@ -619,7 +619,7 @@
         <w:rPr>
           <w:b w:val="0"/>
         </w:rPr>
-        <w:t>Zadanie dotyczy umiędzynarodowienia produktu CargoDT: promocji w regionie CEE i pozyskania partnerów, którzy zintegrują CargoDT przez API ze swoimi systemami TMS. Realizuje je Everest11. Produkt jest wytwarzany w Polsce (pkt 3.2.1).</w:t>
+        <w:t>Zadanie dotyczy umiędzynarodowienia produktu CargoDT: promocji w regionie CEE i pozyskania partnerów, którzy zintegrują CargoDT przez API ze swoimi systemami TMS. Zadanie zrealizuje Everest11. Produkt będzie wytwarzany w Polsce (pkt 3.2.1).</w:t>
       </w:r>
     </w:p>
     <w:p>
@@ -641,7 +641,7 @@
         <w:rPr>
           <w:b w:val="0"/>
         </w:rPr>
-        <w:t>1) Udział w TRANSLOG Connect Congress w Budapeszcie, listopad 2028 r., w roli wystawcy: stoisko z elementem wizualizacji CargoDT, prezentacja prototypu z wynikami walidacji z Z9 i spotkania B2B z dostawcami TMS oraz giełdami transportowymi. Kongres jest wydarzeniem podstawowym zadania.</w:t>
+        <w:t>1) Udział w TRANSLOG Connect Congress w Budapeszcie, listopad 2028 r., w roli wystawcy: stoisko z elementem wizualizacji CargoDT, prezentacja prototypu z wynikami walidacji z Z9 i spotkania B2B z dostawcami TMS oraz giełdami transportowymi. Kongres będzie wydarzeniem podstawowym zadania.</w:t>
       </w:r>
     </w:p>
     <w:p>
@@ -652,7 +652,7 @@
         <w:rPr>
           <w:b w:val="0"/>
         </w:rPr>
-        <w:t>2) Zagraniczna misja wyjazdowa do Czech, I-IV 2029 r.: spotkania z lokalnymi dostawcami TMS i potencjalnymi partnerami licencyjnymi. Wybór organizatora lub formuły misji nastąpi do końca 2028 r., a wyjazd odbędzie się przed 30.04.2029.</w:t>
+        <w:t>2) Zagraniczna misja wyjazdowa do Czech, I-IV 2029 r.: spotkania z lokalnymi dostawcami TMS i potencjalnymi partnerami licencyjnymi. Organizatora lub formułę misji Everest11 wybierze do końca 2028 r., a wyjazd odbędzie się przed 30.04.2029.</w:t>
       </w:r>
     </w:p>
     <w:p>
@@ -663,7 +663,7 @@
         <w:rPr>
           <w:b w:val="0"/>
         </w:rPr>
-        <w:t>3) Usługi doradcze zewnętrznego doradcy, 13 dni: analiza rynków CEE pod kątem wymagań regulacyjnych i kanałów sprzedaży, model partnerstw z dostawcami TMS i licencji API, przygotowanie materiałów do rozmów. Doradztwo jest jednorazowe, nie ma charakteru ciągłego i nie dotyczy bieżącej działalności.</w:t>
+        <w:t>3) Usługi doradcze zewnętrznego doradcy, 13 dni: analiza rynków CEE pod kątem wymagań regulacyjnych i kanałów sprzedaży, model partnerstw z dostawcami TMS i licencji API, przygotowanie materiałów do rozmów. Doradztwo będzie jednorazowe, nie będzie miało charakteru ciągłego i nie obejmie bieżącej działalności.</w:t>
       </w:r>
     </w:p>
     <w:p>
@@ -674,7 +674,7 @@
         <w:rPr>
           <w:b w:val="0"/>
         </w:rPr>
-        <w:t>Delegaci. Na kongres jadą dwie osoby: kierownik zarządzający, który reprezentuje Lidera i podejmuje wstępne ustalenia, oraz specjalista ds. logistyki TSL, który prowadzi spotkania handlowe i prezentuje scenariusze operacyjne. Dwie osoby są potrzebne, bo na stoisku w trakcie dwudniowego kongresu równolegle trwają spotkania 1:1 i prezentacje. Na misję jedzie specjalista ds. logistyki TSL. Obie osoby są zatrudnione w Everest11 i pracują w projekcie.</w:t>
+        <w:t>Delegaci. Na kongres pojadą dwie osoby: kierownik zarządzający, który będzie reprezentować Lidera i podejmować wstępne ustalenia, oraz specjalista ds. logistyki TSL, który poprowadzi spotkania handlowe i zaprezentuje scenariusze operacyjne. Dwie osoby będą potrzebne, bo na stoisku w trakcie dwudniowego kongresu równolegle będą trwać spotkania 1:1 i prezentacje. Na misję pojedzie specjalista ds. logistyki TSL. Obie osoby są zatrudnione w Everest11 i będą pracować w projekcie.</w:t>
       </w:r>
     </w:p>
     <w:p>
@@ -685,7 +685,7 @@
         <w:rPr>
           <w:b w:val="0"/>
         </w:rPr>
-        <w:t>Finansowanie i pomoc. Pakiet wystawcy rozbijamy na opłatę rejestracyjną z rezerwacją miejsca (pomoc de minimis, Przewodnik 5.3.8) oraz wynajem i obsługę stoiska (art. 19 GBER, 5.3.2). Zabudowa stoiska to art. 19 GBER (5.3.1). Podróże rozliczamy stawką jednostkową 5 489 zł na osobę dla Europy: na kongres jako art. 19 GBER (5.3.3), na misję jako de minimis (5.3.4). Doradztwo to art. 18 GBER (5.3.7). Everest11 nie otrzymał pomocy de minimis w ostatnich trzech latach obrotowych (0 zł). Wydatki internacjonalizacyjne Everest11 wynoszą ok. 2,1% jego kosztów prac B+R, a limit to 15%.</w:t>
+        <w:t>Finansowanie i pomoc. Pakiet wystawcy zostanie rozliczony jako opłata za powierzchnię i opłata podstawowa (pomoc de minimis, Przewodnik 5.3.8) oraz energia, zabudowa i meble (art. 19 GBER, 5.3.2). Zabudowa wizualna stoiska to art. 19 GBER (5.3.1). Podróże zostaną rozliczone stawką jednostkową 5 489 zł na osobę dla Europy: na kongres jako art. 19 GBER (5.3.3), na misję jako de minimis (5.3.4). Doradztwo to art. 18 GBER (5.3.7). Wydatki internacjonalizacyjne Everest11 wyniosą ok. 2,1% jego kosztów prac B+R, a limit to 15%.</w:t>
       </w:r>
     </w:p>
     <w:p>
@@ -707,7 +707,7 @@
         <w:rPr>
           <w:b w:val="0"/>
         </w:rPr>
-        <w:t>Ryzyko. Odwołanie lub zmiana terminu kongresu przez organizatora. Wtedy wybieramy porównywalne wydarzenie branżowe w regionie CEE w tym samym okresie kwalifikowalności, a zmiany zgłaszamy w trybie umowy o dofinansowanie.</w:t>
+        <w:t>Ryzyko. Odwołanie lub zmiana terminu kongresu przez organizatora. Wtedy Everest11 wybierze porównywalne wydarzenie branżowe w regionie CEE w tym samym okresie kwalifikowalności i zgłosi zmianę w trybie umowy o dofinansowanie.</w:t>
       </w:r>
     </w:p>
     <w:p>
@@ -735,7 +735,7 @@
           <w:color w:val="666666"/>
           <w:sz w:val="17"/>
         </w:rPr>
-        <w:t xml:space="preserve"> [2428 znaków]</w:t>
+        <w:t xml:space="preserve"> [2455 znaków]</w:t>
       </w:r>
     </w:p>
     <w:p>
@@ -746,7 +746,7 @@
         <w:rPr>
           <w:b w:val="0"/>
         </w:rPr>
-        <w:t>Zadanie dotyczy uzyskania ochrony praw własności przemysłowej. Everest11 zgłasza w procedurze europejskiej przed Europejskim Urzędem Patentowym (EPO) wynalazek: metodę i system predykcji ryzyka uszkodzenia ładunku w transporcie drogowym na podstawie wielomodalnych sygnałów środowiskowych in-transit. Wynalazek jest wynikiem prac Z4 i został potwierdzony danymi terenowymi z Z9.</w:t>
+        <w:t>Zadanie dotyczy uzyskania ochrony praw własności przemysłowej. Everest11 zgłosi w procedurze europejskiej przed Europejskim Urzędem Patentowym (EPO) wynalazek: metodę i system predykcji ryzyka uszkodzenia ładunku w transporcie drogowym na podstawie wielomodalnych sygnałów środowiskowych in-transit. Wynalazek jest wynikiem prac Z4 i zostanie potwierdzony danymi terenowymi z Z9.</w:t>
       </w:r>
     </w:p>
     <w:p>
@@ -757,7 +757,7 @@
         <w:rPr>
           <w:b w:val="0"/>
         </w:rPr>
-        <w:t>Zakres w projekcie kończy się na złożeniu zgłoszenia.</w:t>
+        <w:t>Zakres w projekcie obejmie czynności do złożenia zgłoszenia.</w:t>
       </w:r>
     </w:p>
     <w:p>
@@ -768,7 +768,7 @@
         <w:rPr>
           <w:b w:val="0"/>
         </w:rPr>
-        <w:t>1) Wstępne orzeczenie rzecznika patentowego o zdolności patentowej wynalazku. Zgodnie z Przewodnikiem koszt jest kwalifikowalny, jeśli orzeczenie jest pozytywne.</w:t>
+        <w:t>1) Wstępne orzeczenie rzecznika patentowego o zdolności patentowej wynalazku. Zgodnie z Przewodnikiem koszt jest kwalifikowalny, jeśli orzeczenie będzie pozytywne.</w:t>
       </w:r>
     </w:p>
     <w:p>
@@ -812,7 +812,7 @@
         <w:rPr>
           <w:b w:val="0"/>
         </w:rPr>
-        <w:t>Rzecznik jest podwykonawcą Everest11. Koncepcja wynalazku i zastrzeżenia pozostają po stronie konsorcjum. Poszukiwanie stanu techniki w Z1 i Z11 nie dubluje się: Z1 dotyczy stanu techniki do projektowania systemu, a rzecznik w Z11 ocenia zdolność patentową konkretnego wynalazku.</w:t>
+        <w:t>Rzecznik będzie podwykonawcą Everest11. Koncepcja wynalazku i zastrzeżenia pozostaną po stronie konsorcjum. Poszukiwania stanu techniki w Z1 i Z11 nie będą się dublować: Z1 dotyczy stanu techniki do projektowania systemu, a rzecznik w Z11 oceni zdolność patentową konkretnego wynalazku.</w:t>
       </w:r>
     </w:p>
     <w:p>
@@ -823,7 +823,7 @@
         <w:rPr>
           <w:b w:val="0"/>
         </w:rPr>
-        <w:t>Prawo do zgłoszenia. Prawa do wyniku Z4 przysługują PRz i Everest11 stosownie do wkładu (§ 11 umowy konsorcjum). Przed rozpoczęciem Z11 strony zawierają umowę o wykonywaniu wspólnych praw (§ 11 ust. 5), w której PRz upoważnia Everest11 do dokonania zgłoszenia i ustala podział wynalazców. Przeniesienie praw majątkowych PRz na Lidera za wynagrodzeniem według wyceny niezależnego eksperta przebiega według § 11: oświadczenie Lidera najpóźniej do 28.08.2029, a umowa przeniesienia do 30.11.2029. Szczegóły opisaliśmy w pkt 2.2.</w:t>
+        <w:t>Prawo do zgłoszenia. Prawa do wyniku Z4 będą przysługiwać PRz i Everest11 stosownie do wkładu (§ 11 umowy konsorcjum). Przed rozpoczęciem Z11 strony zawrą umowę o wykonywaniu wspólnych praw (§ 11 ust. 5), w której PRz upoważni Everest11 do dokonania zgłoszenia i ustali podział wynalazców. Przeniesienie praw majątkowych PRz na Lidera za wynagrodzeniem według wyceny niezależnego eksperta nastąpi według § 11: oświadczenie Lidera najpóźniej do 28.08.2029, a umowa przeniesienia do 30.11.2029. Szczegóły opisano w pkt 2.2.</w:t>
       </w:r>
     </w:p>
     <w:p>
@@ -834,7 +834,7 @@
         <w:rPr>
           <w:b w:val="0"/>
         </w:rPr>
-        <w:t>Dalsze etapy procedury EPO, czyli publikacja po ok. 18 miesiącach, badanie merytoryczne, udzielenie i walidacja krajowa, trwają zwykle kilka lat i wykraczają poza projekt. Udzielenie patentu nie jest warunkiem zakończenia zadania, co jest zgodne ze wskaźnikiem produktu dla zgłoszeń. Koszty tych etapów Everest11 ponosi ze środków własnych.</w:t>
+        <w:t>Dalsze etapy procedury EPO, czyli publikacja po ok. 18 miesiącach, badanie merytoryczne, udzielenie i walidacja krajowa, trwają zwykle kilka lat i wykraczają poza projekt. Udzielenie patentu nie będzie warunkiem zakończenia zadania, co jest zgodne ze wskaźnikiem produktu dla zgłoszeń. Koszty tych etapów Everest11 poniesie ze środków własnych.</w:t>
       </w:r>
     </w:p>
     <w:p>
@@ -856,7 +856,7 @@
         <w:rPr>
           <w:b w:val="0"/>
         </w:rPr>
-        <w:t>Ryzyko. Negatywne orzeczenie rzecznika. Wtedy rezygnujemy ze zgłoszenia, koszt orzeczenia jest niekwalifikowalny, a ochronę zapewnia tajemnica przedsiębiorstwa dla wag modeli i kodu oraz prawa autorskie do oprogramowania.</w:t>
+        <w:t>Ryzyko. Negatywne orzeczenie rzecznika. Wtedy Everest11 zrezygnuje ze zgłoszenia, koszt orzeczenia będzie niekwalifikowalny, a ochronę zapewni tajemnica przedsiębiorstwa dla wag modeli i kodu oraz prawa autorskie do oprogramowania.</w:t>
       </w:r>
     </w:p>
     <w:p>
@@ -1027,7 +1027,7 @@
                 <w:b w:val="0"/>
                 <w:sz w:val="18"/>
               </w:rPr>
-              <w:t>Opłata rejestracyjna, rezerwacja miejsca wystawowego i wpis do katalogu TRANSLOG Connect Congress 2028</w:t>
+              <w:t>Opłata za powierzchnię stoiska i opłata podstawowa, TRANSLOG Connect Congress 2028</w:t>
             </w:r>
           </w:p>
         </w:tc>
@@ -1072,7 +1072,7 @@
                 <w:b w:val="0"/>
                 <w:sz w:val="18"/>
               </w:rPr>
-              <w:t>19 680,00</w:t>
+              <w:t>16 953,09</w:t>
             </w:r>
           </w:p>
         </w:tc>
@@ -1087,7 +1087,7 @@
                 <w:b w:val="0"/>
                 <w:sz w:val="18"/>
               </w:rPr>
-              <w:t>16 000,00</w:t>
+              <w:t>13 783,00</w:t>
             </w:r>
           </w:p>
         </w:tc>
@@ -1134,7 +1134,7 @@
                 <w:b w:val="0"/>
                 <w:sz w:val="18"/>
               </w:rPr>
-              <w:t>Wynajem i obsługa stoiska wystawowego na TRANSLOG Connect Congress 2028</w:t>
+              <w:t>Energia, zabudowa i meble stoiska, TRANSLOG Connect Congress 2028</w:t>
             </w:r>
           </w:p>
         </w:tc>
@@ -1179,7 +1179,7 @@
                 <w:b w:val="0"/>
                 <w:sz w:val="18"/>
               </w:rPr>
-              <w:t>9 840,00</w:t>
+              <w:t>12 566,91</w:t>
             </w:r>
           </w:p>
         </w:tc>
@@ -1194,7 +1194,7 @@
                 <w:b w:val="0"/>
                 <w:sz w:val="18"/>
               </w:rPr>
-              <w:t>8 000,00</w:t>
+              <w:t>10 217,00</w:t>
             </w:r>
           </w:p>
         </w:tc>
@@ -1776,7 +1776,7 @@
                 <w:b w:val="0"/>
                 <w:sz w:val="18"/>
               </w:rPr>
-              <w:t>Usługa rzecznika patentowego: dokumentacja zgłoszeniowa i zgłoszenie do EPO</w:t>
+              <w:t>Usługi zewnętrzne rzecznika patentowego: dokumentacja zgłoszeniowa, zgłoszenie do EPO i tłumaczenia</w:t>
             </w:r>
           </w:p>
         </w:tc>
@@ -1806,7 +1806,7 @@
                 <w:b w:val="0"/>
                 <w:sz w:val="18"/>
               </w:rPr>
-              <w:t>Usługi zewnętrzne (prawa własności przemysłowej), Przewodnik 5.3.10 a</w:t>
+              <w:t>Usługi zewnętrzne (prawa własności przemysłowej), Przewodnik 5.3.10 a i b</w:t>
             </w:r>
           </w:p>
         </w:tc>
@@ -1821,7 +1821,7 @@
                 <w:b w:val="0"/>
                 <w:sz w:val="18"/>
               </w:rPr>
-              <w:t>14 760,00</w:t>
+              <w:t>19 065,00</w:t>
             </w:r>
           </w:p>
         </w:tc>
@@ -1836,7 +1836,7 @@
                 <w:b w:val="0"/>
                 <w:sz w:val="18"/>
               </w:rPr>
-              <w:t>12 000,00</w:t>
+              <w:t>15 500,00</w:t>
             </w:r>
           </w:p>
         </w:tc>
@@ -1963,113 +1963,6 @@
           </w:p>
         </w:tc>
       </w:tr>
-      <w:tr>
-        <w:tc>
-          <w:tcPr>
-            <w:tcW w:type="dxa" w:w="567"/>
-          </w:tcPr>
-          <w:p>
-            <w:r/>
-            <w:r>
-              <w:rPr>
-                <w:b w:val="0"/>
-                <w:sz w:val="18"/>
-              </w:rPr>
-              <w:t>11-4</w:t>
-            </w:r>
-          </w:p>
-        </w:tc>
-        <w:tc>
-          <w:tcPr>
-            <w:tcW w:type="dxa" w:w="2438"/>
-          </w:tcPr>
-          <w:p>
-            <w:r/>
-            <w:r>
-              <w:rPr>
-                <w:b w:val="0"/>
-                <w:sz w:val="18"/>
-              </w:rPr>
-              <w:t>Tłumaczenia specjalistyczne dokumentacji zgłoszeniowej</w:t>
-            </w:r>
-          </w:p>
-        </w:tc>
-        <w:tc>
-          <w:tcPr>
-            <w:tcW w:type="dxa" w:w="1701"/>
-          </w:tcPr>
-          <w:p>
-            <w:r/>
-            <w:r>
-              <w:rPr>
-                <w:b w:val="0"/>
-                <w:sz w:val="18"/>
-              </w:rPr>
-              <w:t>pomoc dla MŚP na wspieranie innowacyjności (art. 28 GBER)</w:t>
-            </w:r>
-          </w:p>
-        </w:tc>
-        <w:tc>
-          <w:tcPr>
-            <w:tcW w:type="dxa" w:w="2211"/>
-          </w:tcPr>
-          <w:p>
-            <w:r/>
-            <w:r>
-              <w:rPr>
-                <w:b w:val="0"/>
-                <w:sz w:val="18"/>
-              </w:rPr>
-              <w:t>Usługi zewnętrzne (prawa własności przemysłowej), Przewodnik 5.3.10 b</w:t>
-            </w:r>
-          </w:p>
-        </w:tc>
-        <w:tc>
-          <w:tcPr>
-            <w:tcW w:type="dxa" w:w="964"/>
-          </w:tcPr>
-          <w:p>
-            <w:r/>
-            <w:r>
-              <w:rPr>
-                <w:b w:val="0"/>
-                <w:sz w:val="18"/>
-              </w:rPr>
-              <w:t>4 305,00</w:t>
-            </w:r>
-          </w:p>
-        </w:tc>
-        <w:tc>
-          <w:tcPr>
-            <w:tcW w:type="dxa" w:w="1077"/>
-          </w:tcPr>
-          <w:p>
-            <w:r/>
-            <w:r>
-              <w:rPr>
-                <w:b w:val="0"/>
-                <w:sz w:val="18"/>
-              </w:rPr>
-              <w:t>3 500,00</w:t>
-            </w:r>
-          </w:p>
-        </w:tc>
-        <w:tc>
-          <w:tcPr>
-            <w:tcW w:type="dxa" w:w="567"/>
-          </w:tcPr>
-          <w:p>
-            <w:r/>
-            <w:r>
-              <w:rPr>
-                <w:b w:val="0"/>
-                <w:sz w:val="18"/>
-              </w:rPr>
-              <w:t>50%</w:t>
-            </w:r>
-          </w:p>
-        </w:tc>
-      </w:tr>
     </w:tbl>
     <w:p/>
     <w:p>
@@ -2099,7 +1992,7 @@
         <w:pStyle w:val="Heading3"/>
       </w:pPr>
       <w:r>
-        <w:t>10-1 Opłata rejestracyjna, rezerwacja miejsca wystawowego i wpis do katalogu TRANSLOG Connect Congress 2028</w:t>
+        <w:t>10-1 Opłata za powierzchnię stoiska i opłata podstawowa, TRANSLOG Connect Congress 2028</w:t>
       </w:r>
     </w:p>
     <w:p>
@@ -2125,7 +2018,7 @@
         <w:rPr>
           <w:b w:val="0"/>
         </w:rPr>
-        <w:t>16 000,00 zł netto.</w:t>
+        <w:t>13 783,00 zł netto.</w:t>
       </w:r>
     </w:p>
     <w:p>
@@ -2145,7 +2038,7 @@
           <w:color w:val="666666"/>
           <w:sz w:val="17"/>
         </w:rPr>
-        <w:t xml:space="preserve"> [597 znaków]</w:t>
+        <w:t xml:space="preserve"> [689 znaków]</w:t>
       </w:r>
     </w:p>
     <w:p>
@@ -2156,7 +2049,7 @@
         <w:rPr>
           <w:b w:val="0"/>
         </w:rPr>
-        <w:t>Pozycja obejmuje opłatę rejestracyjną za udział dwóch delegatów w roli wystawcy, rezerwację miejsca wystawowego i spotkań oraz wpis do katalogu kongresu TRANSLOG Connect Congress w Budapeszcie w listopadzie 2028 r. Wydarzenie jest podstawowym działaniem zadania Z10 i warunkiem wskaźnika liczby imprez, w których Everest11 uczestniczy jako wystawca. Koszt jest niezbędny, bo bez opłaty i rezerwacji nie ma udziału w kongresie ani spotkań B2B z dostawcami TMS. Jednostką jest jeden pakiet dla jednego wydarzenia. Everest11 nie otrzymał pomocy de minimis w ostatnich trzech latach obrotowych (0 zł).</w:t>
+        <w:t>Pozycja obejmie rezerwację powierzchni stoiska narożnego 9 m² i opłatę podstawową za udział Everest11 w roli wystawcy w kongresie TRANSLOG Connect Congress w Budapeszcie w listopadzie 2028 r. Opłata podstawowa obejmuje dwa bilety i wyżywienie dla wystawcy, czyli dla dwóch delegatów. Powierzchnia 9 m² będzie potrzebna, bo na stoisku zostanie zaprezentowany prototyp zestawu z panelem HMI i stanowisko z modelem 3D, a dwie osoby będą równolegle prowadzić rozmowy. Wydarzenie jest podstawowym działaniem zadania Z10 i warunkiem wskaźnika liczby imprez, w których Everest11 uczestniczy jako wystawca. Jednostką jest jedna rezerwacja powierzchni i jedna opłata podstawowa na jedno wydarzenie.</w:t>
       </w:r>
     </w:p>
     <w:p>
@@ -2176,7 +2069,7 @@
           <w:color w:val="666666"/>
           <w:sz w:val="17"/>
         </w:rPr>
-        <w:t xml:space="preserve"> [584 znaków]</w:t>
+        <w:t xml:space="preserve"> [625 znaków]</w:t>
       </w:r>
     </w:p>
     <w:p>
@@ -2187,7 +2080,7 @@
         <w:rPr>
           <w:b w:val="0"/>
         </w:rPr>
-        <w:t>Organizator, TEG The Events Group, nie publikuje cennika i w korespondencji e-mail z 2026 r. odpowiedział, że ceny są porównywalne z cenami podobnych wydarzeń. Dlatego pakiet wystawcy dla dwóch delegatów oszacowano na 24 000 zł netto, a podział na składowe przyjęto według struktury oferty kongresu: miejsce spotkań z rezerwacją, rejestracja delegatów i wpis do katalogu stanowią 16 000 zł netto, czyli dwie trzecie pakietu, a wynajem i obsługa stoiska 8 000 zł netto (pozycja 10-2). Kwoty w PLN, bez przeliczeń walutowych. Korespondencja z organizatorem jest w dokumentacji projektu.</w:t>
+        <w:t>Wydatek zostanie poniesiony w EUR i oszacowano go na podstawie cenników historycznych kongresu z wcześniejszych edycji, bo organizator, TEG The Events Group, nie publikuje aktualnego cennika i jest jedynym dostawcą usługi. Przyjęto stoisko narożne 285 EUR/m² (minimum 6 m²) dla 9 m², czyli 2 565 EUR, oraz opłatę podstawową 350 EUR, razem 2 915 EUR. Po kursie średnim NBP z 09.03.2026, 4,2836 PLN/EUR, daje to 12 487 zł. Kwotę powiększono o waloryzację ok. 10,4% do poziomu cen z listopada 2028 r. (ok. 3,4% rocznie przez trzy lata), co daje 13 783 zł. Ujęto koszt według cennika historycznego z waloryzacją, a nie najniższy.</w:t>
       </w:r>
     </w:p>
     <w:p>
@@ -2195,7 +2088,7 @@
         <w:pStyle w:val="Heading3"/>
       </w:pPr>
       <w:r>
-        <w:t>10-2 Wynajem i obsługa stoiska wystawowego na TRANSLOG Connect Congress 2028</w:t>
+        <w:t>10-2 Energia, zabudowa i meble stoiska, TRANSLOG Connect Congress 2028</w:t>
       </w:r>
     </w:p>
     <w:p>
@@ -2221,7 +2114,7 @@
         <w:rPr>
           <w:b w:val="0"/>
         </w:rPr>
-        <w:t>8 000,00 zł netto.</w:t>
+        <w:t>10 217,00 zł netto.</w:t>
       </w:r>
     </w:p>
     <w:p>
@@ -2241,7 +2134,7 @@
           <w:color w:val="666666"/>
           <w:sz w:val="17"/>
         </w:rPr>
-        <w:t xml:space="preserve"> [385 znaków]</w:t>
+        <w:t xml:space="preserve"> [398 znaków]</w:t>
       </w:r>
     </w:p>
     <w:p>
@@ -2252,7 +2145,7 @@
         <w:rPr>
           <w:b w:val="0"/>
         </w:rPr>
-        <w:t>Pozycja obejmuje wynajem wyposażenia stoiska i jego obsługę techniczną w trakcie kongresu w Budapeszcie w 2028 r.: zasilanie, meble, ekspozycja prototypu, obsługa organizatora. Stoisko jest miejscem prezentacji CargoDT dostawcom TMS i giełdom transportowym, a bez niego prezentacja prototypu z wynikami walidacji Z9 nie jest możliwa. Koszt dotyczy jednego stoiska i jednego wydarzenia.</w:t>
+        <w:t>Pozycja obejmie wynajem i obsługę stoiska narożnego 9 m² podczas kongresu w Budapeszcie w 2028 r.: energię i koszty pomocnicze, gotową zabudowę stoiska oraz meble. Stoisko będzie miejscem prezentacji CargoDT dostawcom TMS i giełdom transportowym, a bez zabudowy, zasilania i mebli prezentacja prototypu z wynikami walidacji Z9 nie będzie możliwa. Koszt dotyczy jednego stoiska i jednego wydarzenia.</w:t>
       </w:r>
     </w:p>
     <w:p>
@@ -2272,7 +2165,7 @@
           <w:color w:val="666666"/>
           <w:sz w:val="17"/>
         </w:rPr>
-        <w:t xml:space="preserve"> [450 znaków]</w:t>
+        <w:t xml:space="preserve"> [666 znaków]</w:t>
       </w:r>
     </w:p>
     <w:p>
@@ -2283,7 +2176,7 @@
         <w:rPr>
           <w:b w:val="0"/>
         </w:rPr>
-        <w:t>Kwota jest częścią pakietu wystawcy 24 000 zł netto opisanego w pozycji 10-1: 8 000 zł netto, czyli jedna trzecia pakietu przypadająca na wynajem i obsługę stoiska. Organizator nie publikuje cennika i potwierdził w korespondencji e-mail z 2026 r., że ceny są porównywalne z podobnymi wydarzeniami, więc podział jest oszacowaniem. Pozycje 10-1 i 10-2 razem nie przekraczają 24 000 zł netto. Korespondencja z organizatorem jest w dokumentacji projektu.</w:t>
+        <w:t>Wydatek zostanie poniesiony w EUR i oszacowano go na podstawie cenników historycznych kongresu z wcześniejszych edycji, bo organizator nie publikuje aktualnego cennika i jest jedynym dostawcą usługi. Przyjęto: energię i koszty pomocnicze ok. 130 EUR, gotową zabudowę 199 EUR/m² (górna granica zakresu 77,5 do 199 EUR/m²) dla 9 m², czyli 1 791 EUR, oraz meble 240 EUR (górna granica zakresu 120 do 240 EUR), razem 2 161 EUR. Po kursie średnim NBP z 09.03.2026, 4,2836 PLN/EUR, daje to 9 257 zł. Kwotę powiększono o waloryzację ok. 10,4% do poziomu cen z listopada 2028 r., co daje 10 217 zł. Razem pozycje 10-1 i 10-2 dają 24 000 zł. Ujęto górne granice zakresów cen.</w:t>
       </w:r>
     </w:p>
     <w:p>
@@ -2337,7 +2230,7 @@
           <w:color w:val="666666"/>
           <w:sz w:val="17"/>
         </w:rPr>
-        <w:t xml:space="preserve"> [422 znaków]</w:t>
+        <w:t xml:space="preserve"> [437 znaków]</w:t>
       </w:r>
     </w:p>
     <w:p>
@@ -2348,7 +2241,7 @@
         <w:rPr>
           <w:b w:val="0"/>
         </w:rPr>
-        <w:t>Pozycja obejmuje zindywidualizowany, widoczny element dekoracyjny stoiska z wizualizacją CargoDT: projekt graficzny i wykonanie ścianki lub banera wielkoformatowego w wersji angielskiej. Element jest instalowany na stoisku w Budapeszcie i nie obejmuje ulotek, prezentacji ani materiałów rozdawanych. Koszt jest niezbędny, bo identyfikuje produkt i wystawcę na kongresie. Jednostką jest jeden zestaw projekt plus wykonanie.</w:t>
+        <w:t>Pozycja obejmie zindywidualizowany, widoczny element dekoracyjny stoiska z wizualizacją CargoDT: projekt graficzny i wykonanie ścianki lub banera wielkoformatowego w wersji angielskiej. Element zostanie zainstalowany na stoisku w Budapeszcie i nie obejmie ulotek, prezentacji ani materiałów rozdawanych. Koszt będzie niezbędny, bo element zidentyfikuje produkt i wystawcę na kongresie. Jednostką jest jeden zestaw projekt plus wykonanie.</w:t>
       </w:r>
     </w:p>
     <w:p>
@@ -2368,7 +2261,7 @@
           <w:color w:val="666666"/>
           <w:sz w:val="17"/>
         </w:rPr>
-        <w:t xml:space="preserve"> [257 znaków]</w:t>
+        <w:t xml:space="preserve"> [252 znaków]</w:t>
       </w:r>
     </w:p>
     <w:p>
@@ -2379,7 +2272,7 @@
         <w:rPr>
           <w:b w:val="0"/>
         </w:rPr>
-        <w:t>Źródła to ogólnodostępne cenniki: projekt graficzny 800 zł (ok. 4,5 godz. po 180 zł, cennik Soluma Interactive) oraz wydruk wielkoformatowy elementu 400 zł (cennik Oferia.com.pl), dostęp 2026. Razem 1 200 zł netto. Przyjęto wartość z cenników bez marginesu.</w:t>
+        <w:t>Źródłem są ogólnodostępne cenniki: projekt graficzny 800 zł (ok. 4,5 godz. po 180 zł, cennik Soluma Interactive) oraz wydruk wielkoformatowy elementu 400 zł (cennik Oferia.com.pl), dostęp 2026. Razem 1 200 zł. Przyjęto wartość z cenników bez marginesu.</w:t>
       </w:r>
     </w:p>
     <w:p>
@@ -2433,7 +2326,7 @@
           <w:color w:val="666666"/>
           <w:sz w:val="17"/>
         </w:rPr>
-        <w:t xml:space="preserve"> [567 znaków]</w:t>
+        <w:t xml:space="preserve"> [814 znaków]</w:t>
       </w:r>
     </w:p>
     <w:p>
@@ -2444,7 +2337,7 @@
         <w:rPr>
           <w:b w:val="0"/>
         </w:rPr>
-        <w:t>Zewnętrzny doradca wykona 13 dni usług o koszcie jednostkowym 1 000 zł za dzień: 4 dni analizy rynków Czech, Słowacji, Węgier i Rumunii pod kątem regulacji i kanałów sprzedaży, 5 dni na model partnerstw z dostawcami TMS i warunków licencji API, 4 dni na przygotowanie materiałów i scenariuszy rozmów na kongres i misję. Usługa jest jednorazowa, nie ma charakteru ciągłego i nie obejmuje doradztwa podatkowego, księgowego, prawnego ani reklamy. Doradca nie jest powiązany z Everest11. Koszt jest niezbędny, bo Everest11 nie ma doświadczenia w sprzedaży w regionie CEE.</w:t>
+        <w:t>W ramach zaplanowanego kosztu niezbędne będzie wykonanie usług polegających na analizie rynków Czech, Słowacji, Węgier i Rumunii pod kątem regulacji i kanałów sprzedaży, opracowaniu modelu partnerstw z dostawcami TMS i warunków licencji API, a także przygotowaniu materiałów i scenariuszy rozmów na kongres i misję. Usługa będzie jednorazowa (nieciągła), z wyłączeniem doradztwa podatkowego, księgowego, prawnego oraz reklamy, a zewnętrzny doradca nie będzie w żaden sposób powiązany z Everest11. Powyższe prace zostaną zrealizowane w celu wsparcia i przygotowania procesu sprzedaży w regionie CEE, ponieważ Everest11 nie posiada w tym obszarze niezbędnego doświadczenia. Zaangażowanie: 13 dni x 8 h x 125 PLN (łączny czas podzielony na: 4 dni analizy, 5 dni na model partnerstw, 4 dni na materiały i scenariusze).</w:t>
       </w:r>
     </w:p>
     <w:p>
@@ -2464,7 +2357,7 @@
           <w:color w:val="666666"/>
           <w:sz w:val="17"/>
         </w:rPr>
-        <w:t xml:space="preserve"> [384 znaków]</w:t>
+        <w:t xml:space="preserve"> [485 znaków]</w:t>
       </w:r>
     </w:p>
     <w:p>
@@ -2475,7 +2368,7 @@
         <w:rPr>
           <w:b w:val="0"/>
         </w:rPr>
-        <w:t>Stawkę dzienną 1 000 zł przyjęto na podstawie stawek rynkowych analityków biznesowych na poziomie mid i senior w kontraktach B2B (No Fluff Jobs, dostęp 2026) jako kwotę reprezentatywną dla doradcy o tym profilu. Liczba dni wynika z podziału zakresu: 4 plus 5 plus 4 dni, razem 13 dni, co daje 13 000 zł netto. Wybór doradcy nastąpi w trybie rozeznania rynku przed rozpoczęciem usługi.</w:t>
+        <w:t>Koszt jednostkowy 125 zł za godzinę, czyli 1 000 zł za dzień 8-godzinny, przyjęto na podstawie stawek rynkowych analityków biznesowych na poziomie mid i senior w kontraktach B2B (No Fluff Jobs, dostęp 2026). Liczba dni wynika z podziału zakresu: 4 plus 5 plus 4 dni, razem 13 dni, co daje 13 x 8 h x 125 zł = 13 000 zł. Wybór doradcy nastąpi w trybie rozeznania rynku przed rozpoczęciem usługi, a do rozliczenia zostanie przyjęta cena z wybranej oferty, nie wyższa niż kwota z wniosku.</w:t>
       </w:r>
     </w:p>
     <w:p>
@@ -2529,7 +2422,7 @@
           <w:color w:val="666666"/>
           <w:sz w:val="17"/>
         </w:rPr>
-        <w:t xml:space="preserve"> [545 znaków]</w:t>
+        <w:t xml:space="preserve"> [471 znaków]</w:t>
       </w:r>
     </w:p>
     <w:p>
@@ -2540,7 +2433,7 @@
         <w:rPr>
           <w:b w:val="0"/>
         </w:rPr>
-        <w:t>Rzecznik patentowy wyda wstępne orzeczenie o zdolności patentowej wynalazku: metody i systemu predykcji ryzyka uszkodzenia ładunku z wielomodalnych sygnałów in-transit. Orzeczenie obejmuje przegląd stanu techniki w bazach patentowych i ocenę nowości oraz poziomu wynalazczego. Jest warunkiem decyzji o zgłoszeniu i niezbędne, bo Everest11 nie ma w zespole rzecznika. Koszt jest kwalifikowalny, jeśli orzeczenie jest pozytywne. Jednostką jest jedno orzeczenie. Everest11 nie otrzymał pomocy de minimis w ostatnich trzech latach obrotowych (0 zł).</w:t>
+        <w:t>Rzecznik patentowy wyda wstępne orzeczenie o zdolności patentowej wynalazku: metody i systemu predykcji ryzyka uszkodzenia ładunku z wielomodalnych sygnałów in-transit. Orzeczenie obejmie przegląd stanu techniki w bazach patentowych i ocenę nowości oraz poziomu wynalazczego. Będzie warunkiem decyzji o zgłoszeniu i będzie niezbędne, bo Everest11 nie ma w zespole rzecznika. Koszt będzie kwalifikowalny, jeśli orzeczenie będzie pozytywne. Jednostką jest jedno orzeczenie.</w:t>
       </w:r>
     </w:p>
     <w:p>
@@ -2560,7 +2453,7 @@
           <w:color w:val="666666"/>
           <w:sz w:val="17"/>
         </w:rPr>
-        <w:t xml:space="preserve"> [319 znaków]</w:t>
+        <w:t xml:space="preserve"> [293 znaków]</w:t>
       </w:r>
     </w:p>
     <w:p>
@@ -2571,7 +2464,7 @@
         <w:rPr>
           <w:b w:val="0"/>
         </w:rPr>
-        <w:t>Źródło: oferta kancelarii JWP Rzecznicy Patentowi z 11.06.2026 (honoraria netto, VAT 23% doliczany): badanie zdolności patentowej 6 000 do 8 000 zł. Przyjęto górną granicę 8 000 zł netto z uwagi na złożoność wynalazku, który obejmuje fuzję sygnałów, modele ML i sensorykę. Zakres z oferty nie obejmuje opłat urzędowych.</w:t>
+        <w:t>Podstawą jest oferta kancelarii JWP Rzecznicy Patentowi z 11.06.2026: badanie zdolności patentowej 6 000 do 8 000 zł. Przyjęto górną granicę przedziału, 8 000 zł, z uwagi na złożoność wynalazku, który obejmuje fuzję sygnałów, modele ML i sensorykę. Zakres oferty nie obejmuje opłat urzędowych.</w:t>
       </w:r>
     </w:p>
     <w:p>
@@ -2579,7 +2472,7 @@
         <w:pStyle w:val="Heading3"/>
       </w:pPr>
       <w:r>
-        <w:t>11-2 Usługa rzecznika patentowego: dokumentacja zgłoszeniowa i zgłoszenie do EPO</w:t>
+        <w:t>11-2 Usługi zewnętrzne rzecznika patentowego: dokumentacja zgłoszeniowa, zgłoszenie do EPO i tłumaczenia</w:t>
       </w:r>
     </w:p>
     <w:p>
@@ -2605,7 +2498,7 @@
         <w:rPr>
           <w:b w:val="0"/>
         </w:rPr>
-        <w:t>12 000,00 zł netto.</w:t>
+        <w:t>15 500,00 zł netto.</w:t>
       </w:r>
     </w:p>
     <w:p>
@@ -2625,7 +2518,7 @@
           <w:color w:val="666666"/>
           <w:sz w:val="17"/>
         </w:rPr>
-        <w:t xml:space="preserve"> [473 znaków]</w:t>
+        <w:t xml:space="preserve"> [671 znaków]</w:t>
       </w:r>
     </w:p>
     <w:p>
@@ -2636,7 +2529,7 @@
         <w:rPr>
           <w:b w:val="0"/>
         </w:rPr>
-        <w:t>Rzecznik przygotuje dokumentację zgłoszeniową: opis wynalazku, zastrzeżenia patentowe i rysunki, oraz złoży zgłoszenie w EPO i będzie reprezentował Everest11 przed urzędem do momentu złożenia. Usługa jest niezbędna, bo zgłoszenie przed EPO wymaga zawodowego pełnomocnika i precyzyjnych zastrzeżeń, a Everest11 nie ma tych kompetencji. Zakres nie obejmuje dalszego prowadzenia postępowania po złożeniu zgłoszenia ani badania zdolności patentowej, które ujęto w pozycji 11-1.</w:t>
+        <w:t>Rzecznik przygotuje dokumentację zgłoszeniową: opis wynalazku, zastrzeżenia patentowe i rysunki, złoży zgłoszenie w EPO i będzie reprezentował Everest11 przed urzędem do momentu złożenia. Usługa będzie niezbędna, bo zgłoszenie przed EPO wymaga zawodowego pełnomocnika i precyzyjnych zastrzeżeń, a Everest11 nie ma tych kompetencji. Pozycja obejmie także tłumaczenie PL-EN opisu wynalazku i zastrzeżeń, z terminologią AI, ML, sensoryki i transportu, o objętości ok. 5 800 słów, bo dokumentacja musi być złożona w języku urzędowym EPO. Zakres nie obejmie dalszego prowadzenia postępowania po złożeniu zgłoszenia ani badania zdolności patentowej, które ujęto w pozycji 11-1.</w:t>
       </w:r>
     </w:p>
     <w:p>
@@ -2656,7 +2549,7 @@
           <w:color w:val="666666"/>
           <w:sz w:val="17"/>
         </w:rPr>
-        <w:t xml:space="preserve"> [349 znaków]</w:t>
+        <w:t xml:space="preserve"> [600 znaków]</w:t>
       </w:r>
     </w:p>
     <w:p>
@@ -2667,7 +2560,7 @@
         <w:rPr>
           <w:b w:val="0"/>
         </w:rPr>
-        <w:t>Źródło: oferta JWP Rzecznicy Patentowi z 11.06.2026 (netto, VAT 23% doliczany): opracowanie dokumentacji zgłoszeniowej i złożenie zgłoszenia w procedurze europejskiej od 10 000 do 12 000 zł. Przyjęto górną granicę 12 000 zł netto. Razem z pozycją 11-1 daje to 20 000 zł, czyli górną granicę całej oferty 16 000 do 20 000 zł netto, bez przekroczenia.</w:t>
+        <w:t>Podstawą jest oferta kancelarii JWP Rzecznicy Patentowi z 11.06.2026. Opracowanie dokumentacji zgłoszeniowej i złożenie zgłoszenia w procedurze europejskiej: przedział 10 000 do 12 000 zł, przyjęto górną granicę, 12 000 zł. Tłumaczenie PL-EN: stawka z oferty 60 zł za 100 słów, objętość ok. 5 800 słów daje 3 480 zł, zaokrąglone do 3 500 zł. Razem 15 500 zł. Razem z pozycją 11-1 usługi rzecznika bez tłumaczeń wyniosą 20 000 zł, czyli górną granicę całej oferty 16 000 do 20 000 zł. Kontrolnie: rynkowe stawki tłumaczeń specjalistycznych 80 do 200 zł za stronę rozliczeniową (tlumaczymy24.pl, 2026).</w:t>
       </w:r>
     </w:p>
     <w:p>
@@ -2721,7 +2614,7 @@
           <w:color w:val="666666"/>
           <w:sz w:val="17"/>
         </w:rPr>
-        <w:t xml:space="preserve"> [311 znaków]</w:t>
+        <w:t xml:space="preserve"> [321 znaków]</w:t>
       </w:r>
     </w:p>
     <w:p>
@@ -2732,7 +2625,7 @@
         <w:rPr>
           <w:b w:val="0"/>
         </w:rPr>
-        <w:t>Zgłoszenie w EPO wymaga opłaty zgłoszeniowej i opłaty za sprawozdanie z poszukiwania europejskiego. Opłaty są warunkiem formalnym rozpoczęcia postępowania i uzyskania daty pierwszeństwa. Wydatki ogółem są równe kwalifikowalnym, bo opłaty urzędowe wnoszone na rzecz organizacji międzynarodowej nie podlegają VAT.</w:t>
+        <w:t>Zgłoszenie w EPO będzie wymagać opłaty zgłoszeniowej i opłaty za sprawozdanie z poszukiwania europejskiego. Opłaty będą warunkiem formalnym rozpoczęcia postępowania i uzyskania daty pierwszeństwa. Wydatki ogółem są równe kwalifikowalnym, bo opłaty urzędowe wnoszone na rzecz organizacji międzynarodowej nie podlegają VAT.</w:t>
       </w:r>
     </w:p>
     <w:p>
@@ -2764,102 +2657,6 @@
           <w:b w:val="0"/>
         </w:rPr>
         <w:t>Źródło: taryfa opłat EPO obowiązująca od 1.04.2026 (Schedule of Fees, decyzja Rady Administracyjnej CA/D 9/25): opłata zgłoszeniowa online 135 EUR plus opłata za poszukiwanie europejskie 1 595 EUR, razem 1 730 EUR. Kurs średni NBP z dnia ogłoszenia naboru, 09.03.2026, wynosił 4,2836 PLN/EUR, co daje 7 410,63 zł. Przyjęto kurs planistyczny 4,50 PLN/EUR, o 5% wyższy, co daje 7 785 zł i zawiera bufor na zmianę kursu do czasu poniesienia wydatku.</w:t>
-      </w:r>
-    </w:p>
-    <w:p>
-      <w:pPr>
-        <w:pStyle w:val="Heading3"/>
-      </w:pPr>
-      <w:r>
-        <w:t>11-4 Tłumaczenia specjalistyczne dokumentacji zgłoszeniowej</w:t>
-      </w:r>
-    </w:p>
-    <w:p>
-      <w:r>
-        <w:rPr>
-          <w:b/>
-        </w:rPr>
-        <w:t xml:space="preserve">Zadanie: </w:t>
-      </w:r>
-      <w:r>
-        <w:rPr>
-          <w:b w:val="0"/>
-        </w:rPr>
-        <w:t xml:space="preserve">Z11. </w:t>
-      </w:r>
-      <w:r>
-        <w:rPr>
-          <w:b/>
-        </w:rPr>
-        <w:t xml:space="preserve">Kwota kwalifikowalna: </w:t>
-      </w:r>
-      <w:r>
-        <w:rPr>
-          <w:b w:val="0"/>
-        </w:rPr>
-        <w:t>3 500,00 zł netto.</w:t>
-      </w:r>
-    </w:p>
-    <w:p>
-      <w:pPr>
-        <w:keepNext/>
-        <w:spacing w:before="160" w:after="40"/>
-      </w:pPr>
-      <w:r>
-        <w:rPr>
-          <w:b/>
-          <w:sz w:val="20"/>
-        </w:rPr>
-        <w:t>Uzasadnienie kosztu (limit 1500)</w:t>
-      </w:r>
-      <w:r>
-        <w:rPr>
-          <w:color w:val="666666"/>
-          <w:sz w:val="17"/>
-        </w:rPr>
-        <w:t xml:space="preserve"> [344 znaków]</w:t>
-      </w:r>
-    </w:p>
-    <w:p>
-      <w:pPr>
-        <w:spacing w:after="60"/>
-      </w:pPr>
-      <w:r>
-        <w:rPr>
-          <w:b w:val="0"/>
-        </w:rPr>
-        <w:t>Dokumentacja zgłoszeniowa musi być złożona w języku urzędowym EPO. Tłumaczenie obejmuje opis wynalazku i zastrzeżenia patentowe z terminologią AI, ML, sensoryki i transportu, a precyzja tłumaczenia wpływa na zakres ochrony. Pozycja jest niezbędna do złożenia zgłoszenia. Jednostką jest jedno tłumaczenie dokumentacji o objętości ok. 5 800 słów.</w:t>
-      </w:r>
-    </w:p>
-    <w:p>
-      <w:pPr>
-        <w:keepNext/>
-        <w:spacing w:before="160" w:after="40"/>
-      </w:pPr>
-      <w:r>
-        <w:rPr>
-          <w:b/>
-          <w:sz w:val="20"/>
-        </w:rPr>
-        <w:t>Metoda szacowania (limit 1500)</w:t>
-      </w:r>
-      <w:r>
-        <w:rPr>
-          <w:color w:val="666666"/>
-          <w:sz w:val="17"/>
-        </w:rPr>
-        <w:t xml:space="preserve"> [354 znaków]</w:t>
-      </w:r>
-    </w:p>
-    <w:p>
-      <w:pPr>
-        <w:spacing w:after="60"/>
-      </w:pPr>
-      <w:r>
-        <w:rPr>
-          <w:b w:val="0"/>
-        </w:rPr>
-        <w:t>Źródło: oferta JWP Rzecznicy Patentowi z 11.06.2026: tłumaczenie PL-EN opisu zgłoszeniowego 60 zł netto za 100 słów. Objętość ok. 5 800 słów daje 3 480 zł, zaokrąglone do 3 500 zł netto. Kontrolnie: rynkowe stawki tłumaczeń specjalistycznych 80 do 200 zł za stronę rozliczeniową (tlumaczymy24.pl, 2026), co dla 20 do 30 stron daje podobny rząd wielkości.</w:t>
       </w:r>
     </w:p>
     <w:p>
@@ -3174,7 +2971,7 @@
           <w:color w:val="666666"/>
           <w:sz w:val="17"/>
         </w:rPr>
-        <w:t xml:space="preserve"> [732 znaków]</w:t>
+        <w:t xml:space="preserve"> [763 znaków]</w:t>
       </w:r>
     </w:p>
     <w:p>
@@ -3185,7 +2982,7 @@
         <w:rPr>
           <w:b w:val="0"/>
         </w:rPr>
-        <w:t>Wyjazd na TRANSLOG Connect Congress w Budapeszcie w listopadzie 2028 r. jest podstawowym działaniem zadania Z10. Jadą dwie osoby: kierownik zarządzający, który reprezentuje Lidera i podejmuje wstępne ustalenia z partnerami, oraz specjalista ds. logistyki TSL, który prowadzi spotkania handlowe i prezentuje scenariusze operacyjne. Dwie osoby są potrzebne, bo w trakcie dwudniowego kongresu równolegle trwają prezentacje na stoisku i spotkania B2B 1:1, a zadania obu osób są różne. Liczba osób wynika z zadań, a nie z dostępnego budżetu. Obie osoby są zatrudnione w Everest11 i pracują przy realizacji projektu. Stawka dla Europy to 5 489 zł na osobę na wyjazd (Przewodnik 5.3.4). Kongres odbywa się poza miejscem siedziby Everest11.</w:t>
+        <w:t>Wyjazd na TRANSLOG Connect Congress w Budapeszcie w listopadzie 2028 r. będzie podstawowym działaniem zadania Z10. Pojadą dwie osoby: kierownik zarządzający, który będzie reprezentować Lidera i podejmować wstępne ustalenia z partnerami, oraz specjalista ds. logistyki TSL, który poprowadzi spotkania handlowe i zaprezentuje scenariusze operacyjne. Dwie osoby będą potrzebne, bo w trakcie dwudniowego kongresu równolegle będą trwać prezentacje na stoisku i spotkania B2B 1:1, a zadania obu osób są różne. Liczba osób wynika z zadań, a nie z dostępnego budżetu. Obie osoby są zatrudnione w Everest11 i będą pracować przy realizacji projektu. Stawka dla Europy to 5 489 zł na osobę na wyjazd (Przewodnik 5.3.4). Kongres odbędzie się poza miejscem siedziby Everest11.</w:t>
       </w:r>
     </w:p>
     <w:p>
@@ -3481,7 +3278,7 @@
           <w:color w:val="666666"/>
           <w:sz w:val="17"/>
         </w:rPr>
-        <w:t xml:space="preserve"> [714 znaków]</w:t>
+        <w:t xml:space="preserve"> [636 znaków]</w:t>
       </w:r>
     </w:p>
     <w:p>
@@ -3492,7 +3289,7 @@
         <w:rPr>
           <w:b w:val="0"/>
         </w:rPr>
-        <w:t>Wyjazd na misję gospodarczą do Czech w 2029 r., przed końcem zadania Z10 (30.04.2029), służy spotkaniom z lokalnymi dostawcami TMS i partnerami licencyjnymi. Jedzie jedna osoba, specjalista ds. logistyki TSL, który prowadził wcześniejsze rozmowy z partnerami na kongresie i prowadzi rozmowy handlowe po stronie Lidera. Jedna osoba wystarcza, bo misja jest etapem kontynuacji kontaktów z kongresu i nie obejmuje stoiska ani prezentacji sprzętu. Liczba osób wynika z zadań, a nie z budżetu. Osoba jest zatrudniona w Everest11 i pracuje przy realizacji projektu. Stawka dla Europy to 5 489 zł na osobę na wyjazd (Przewodnik 5.3.4). Everest11 nie otrzymał pomocy de minimis w ostatnich trzech latach obrotowych (0 zł).</w:t>
+        <w:t>Wyjazd na misję gospodarczą do Czech w 2029 r., przed końcem zadania Z10 (30.04.2029), posłuży spotkaniom z lokalnymi dostawcami TMS i partnerami licencyjnymi. Pojedzie jedna osoba, specjalista ds. logistyki TSL, który będzie kontynuował rozmowy rozpoczęte na kongresie i prowadził rozmowy handlowe po stronie Lidera. Jedna osoba wystarczy, bo misja będzie etapem kontynuacji kontaktów z kongresu i nie obejmie stoiska ani prezentacji sprzętu. Liczba osób wynika z zadań, a nie z budżetu. Osoba jest zatrudniona w Everest11 i będzie pracować przy realizacji projektu. Stawka dla Europy to 5 489 zł na osobę na wyjazd (Przewodnik 5.3.4).</w:t>
       </w:r>
     </w:p>
     <w:p>
@@ -3660,7 +3457,7 @@
           <w:color w:val="666666"/>
           <w:sz w:val="17"/>
         </w:rPr>
-        <w:t xml:space="preserve"> [320 znaków]</w:t>
+        <w:t xml:space="preserve"> [340 znaków]</w:t>
       </w:r>
     </w:p>
     <w:p>
@@ -3671,7 +3468,7 @@
         <w:rPr>
           <w:b w:val="0"/>
         </w:rPr>
-        <w:t>Wartość docelowa 3 to suma wyjazdów służbowych pracowników Everest11 na terytorium Europy: 2 osoby na TRANSLOG Connect Congress w Budapeszcie w 2028 r. i 1 osoba na misję gospodarczą do Czech w 2029 r. Osoba, która jedzie na dwa wydarzenia, jest liczona dwa razy. Wskaźnik osiąga Everest11, a PRz nie realizuje wyjazdów.</w:t>
+        <w:t>Wartość docelowa 3 jest sumą wyjazdów służbowych pracowników Everest11 na terytorium Europy: 2 osoby na TRANSLOG Connect Congress w Budapeszcie w 2028 r. i 1 osoba na misję gospodarczą do Czech w 2029 r. Osoba, która pojedzie na dwa wydarzenia, zostanie policzona dwa razy. Wskaźnik osiągnie Everest11, a PRz nie będzie realizować wyjazdów.</w:t>
       </w:r>
     </w:p>
     <w:p>
@@ -3732,7 +3529,7 @@
         <w:rPr>
           <w:b w:val="0"/>
         </w:rPr>
-        <w:t>W polu metodologii zdanie „wykupionego pakietu wystawcy ujętego w budżecie zadania Z10 (24 000 PLN, 2 delegatów)” zastąp zdaniem: „pakietu wystawcy dla dwóch delegatów ujętego w budżecie zadania Z10 jako opłata rejestracyjna z rezerwacją miejsca i wynajem stoiska, razem 24 000 zł netto”. Reszta bez zmian.</w:t>
+        <w:t>W polu metodologii zdanie „wykupionego pakietu wystawcy ujętego w budżecie zadania Z10 (24 000 PLN, 2 delegatów)” zastąp zdaniem: „opłaty za powierzchnię stoiska i opłaty podstawowej (z biletami dla dwóch delegatów) oraz energii, zabudowy i mebli, ujętych w budżecie zadania Z10, razem 24 000 zł”. Reszta bez zmian.</w:t>
       </w:r>
     </w:p>
     <w:p>
@@ -4007,7 +3804,7 @@
           <w:color w:val="666666"/>
           <w:sz w:val="17"/>
         </w:rPr>
-        <w:t xml:space="preserve"> [677 znaków]</w:t>
+        <w:t xml:space="preserve"> [683 znaków]</w:t>
       </w:r>
     </w:p>
     <w:p>
@@ -4018,7 +3815,7 @@
         <w:rPr>
           <w:b w:val="0"/>
         </w:rPr>
-        <w:t>Rokiem osiągnięcia wartości docelowej jest 2030, czyli rok po zakończeniu projektu w kwietniu 2029 r. W 2030 r. następuje start sprzedaży komercyjnej, a nabywcami są klienci w Polsce: operatorzy objęci listami intencyjnymi na 50 pojazdów. Przychody poza terytorium RP w tym roku nie wystąpią, więc wartość docelowa wynosi 0 zł. Pierwsze przychody ze sprzedaży poza RP wynikają z modelu finansowego od 2032-2033 r., z licencji API dla dostawców TMS w regionie CEE pozyskanych w zadaniu Z10, po 4 800 zł za umowę rocznie. Subskrypcje SaaS i zestawy sprzedane klientom w Polsce nie wchodzą do wskaźnika, nawet jeśli pojazdy jeżdżą za granicą. Wskaźnik dotyczy wyłącznie Everest11.</w:t>
+        <w:t>Rokiem osiągnięcia wartości docelowej będzie 2030, czyli rok po zakończeniu projektu w kwietniu 2029 r. W 2030 r. nastąpi start sprzedaży komercyjnej, a nabywcami będą klienci w Polsce: operatorzy objęci listami intencyjnymi na 50 pojazdów. Przychody poza terytorium RP w tym roku nie wystąpią, więc wartość docelowa wynosi 0 zł. Pierwsze przychody ze sprzedaży poza RP wynikają z modelu finansowego od 2032-2033 r., z licencji API dla dostawców TMS w regionie CEE pozyskanych w zadaniu Z10, po 4 800 zł za umowę rocznie. Subskrypcje SaaS i zestawy sprzedane klientom w Polsce nie wejdą do wskaźnika, nawet jeśli pojazdy będą jeździć za granicą. Wskaźnik dotyczy wyłącznie Everest11.</w:t>
       </w:r>
     </w:p>
     <w:p>
@@ -4049,7 +3846,7 @@
         <w:rPr>
           <w:b w:val="0"/>
         </w:rPr>
-        <w:t>Sprawozdanie finansowe Everest11 za 2030 r. z przychodami CargoDT w podziale na kraj nabywcy, rejestr umów i faktur sprzedaży z danymi nabywców. Wartość 0 potwierdza brak faktur dla nabywców zagranicznych w 2030 r.</w:t>
+        <w:t>Sprawozdanie finansowe Everest11 za 2030 r. z przychodami CargoDT w podziale na kraj nabywcy, rejestr umów i faktur sprzedaży z danymi nabywców. Wartość 0 potwierdzi brak faktur dla nabywców zagranicznych w 2030 r.</w:t>
       </w:r>
     </w:p>
     <w:p>
@@ -4167,7 +3964,18 @@
         <w:pStyle w:val="Heading1"/>
       </w:pPr>
       <w:r>
-        <w:t>8. Zadania po Twojej stronie</w:t>
+        <w:t>8. Sprawdzenie zgodności z Instrukcją (pkt 3.2.3)</w:t>
+      </w:r>
+    </w:p>
+    <w:p>
+      <w:pPr>
+        <w:spacing w:after="60"/>
+      </w:pPr>
+      <w:r>
+        <w:rPr>
+          <w:b w:val="0"/>
+        </w:rPr>
+        <w:t>Instrukcja wymaga w uzasadnieniu kosztu: rodzaju usług, kosztu jednostkowego każdej usługi, liczby i zakresu oraz wykazania, że koszt jest niezbędny i dostosowany do zakresu. W metodzie szacowania wymaga: nazw źródeł danych, liczby i nazw dostawców, do których wysłano zapytanie ofertowe, liczby i nazw dostawców, którzy odpowiedzieli, wraz z kwotami, oraz wskazania, jaki koszt przyjęto (najwyższy, najniższy, średni, inny), a dla ogólnodostępnych cenników źródła.</w:t>
       </w:r>
     </w:p>
     <w:tbl>
@@ -4184,7 +3992,7 @@
       <w:tr>
         <w:tc>
           <w:tcPr>
-            <w:tcW w:type="dxa" w:w="567"/>
+            <w:tcW w:type="dxa" w:w="1361"/>
           </w:tcPr>
           <w:p>
             <w:r/>
@@ -4193,13 +4001,347 @@
                 <w:b/>
                 <w:sz w:val="18"/>
               </w:rPr>
-              <w:t>Nr</w:t>
+              <w:t>Pozycja</w:t>
             </w:r>
           </w:p>
         </w:tc>
         <w:tc>
           <w:tcPr>
-            <w:tcW w:type="dxa" w:w="6917"/>
+            <w:tcW w:type="dxa" w:w="3572"/>
+          </w:tcPr>
+          <w:p>
+            <w:r/>
+            <w:r>
+              <w:rPr>
+                <w:b/>
+                <w:sz w:val="18"/>
+              </w:rPr>
+              <w:t>Uzasadnienie kosztu</w:t>
+            </w:r>
+          </w:p>
+        </w:tc>
+        <w:tc>
+          <w:tcPr>
+            <w:tcW w:type="dxa" w:w="4819"/>
+          </w:tcPr>
+          <w:p>
+            <w:r/>
+            <w:r>
+              <w:rPr>
+                <w:b/>
+                <w:sz w:val="18"/>
+              </w:rPr>
+              <w:t>Metoda szacowania</w:t>
+            </w:r>
+          </w:p>
+        </w:tc>
+      </w:tr>
+      <w:tr>
+        <w:tc>
+          <w:tcPr>
+            <w:tcW w:type="dxa" w:w="1361"/>
+          </w:tcPr>
+          <w:p>
+            <w:r/>
+            <w:r>
+              <w:rPr>
+                <w:b w:val="0"/>
+                <w:sz w:val="18"/>
+              </w:rPr>
+              <w:t>10-1, 10-2</w:t>
+            </w:r>
+          </w:p>
+        </w:tc>
+        <w:tc>
+          <w:tcPr>
+            <w:tcW w:type="dxa" w:w="3572"/>
+          </w:tcPr>
+          <w:p>
+            <w:r/>
+            <w:r>
+              <w:rPr>
+                <w:b w:val="0"/>
+                <w:sz w:val="18"/>
+              </w:rPr>
+              <w:t>Zgodne: zakres, jednostka, niezbędność.</w:t>
+            </w:r>
+          </w:p>
+        </w:tc>
+        <w:tc>
+          <w:tcPr>
+            <w:tcW w:type="dxa" w:w="4819"/>
+          </w:tcPr>
+          <w:p>
+            <w:r/>
+            <w:r>
+              <w:rPr>
+                <w:b w:val="0"/>
+                <w:sz w:val="18"/>
+              </w:rPr>
+              <w:t>Zgodne: źródło (cennik historyczny organizatora, jedyny dostawca), rozbicie na składowe, kurs z datą, przyjęty koszt (górne granice zakresów plus waloryzacja).</w:t>
+            </w:r>
+          </w:p>
+        </w:tc>
+      </w:tr>
+      <w:tr>
+        <w:tc>
+          <w:tcPr>
+            <w:tcW w:type="dxa" w:w="1361"/>
+          </w:tcPr>
+          <w:p>
+            <w:r/>
+            <w:r>
+              <w:rPr>
+                <w:b w:val="0"/>
+                <w:sz w:val="18"/>
+              </w:rPr>
+              <w:t>10-3</w:t>
+            </w:r>
+          </w:p>
+        </w:tc>
+        <w:tc>
+          <w:tcPr>
+            <w:tcW w:type="dxa" w:w="3572"/>
+          </w:tcPr>
+          <w:p>
+            <w:r/>
+            <w:r>
+              <w:rPr>
+                <w:b w:val="0"/>
+                <w:sz w:val="18"/>
+              </w:rPr>
+              <w:t>Zgodne.</w:t>
+            </w:r>
+          </w:p>
+        </w:tc>
+        <w:tc>
+          <w:tcPr>
+            <w:tcW w:type="dxa" w:w="4819"/>
+          </w:tcPr>
+          <w:p>
+            <w:r/>
+            <w:r>
+              <w:rPr>
+                <w:b w:val="0"/>
+                <w:sz w:val="18"/>
+              </w:rPr>
+              <w:t>Zgodne: ogólnodostępne cenniki, nazwy źródeł.</w:t>
+            </w:r>
+          </w:p>
+        </w:tc>
+      </w:tr>
+      <w:tr>
+        <w:tc>
+          <w:tcPr>
+            <w:tcW w:type="dxa" w:w="1361"/>
+          </w:tcPr>
+          <w:p>
+            <w:r/>
+            <w:r>
+              <w:rPr>
+                <w:b w:val="0"/>
+                <w:sz w:val="18"/>
+              </w:rPr>
+              <w:t>10-6</w:t>
+            </w:r>
+          </w:p>
+        </w:tc>
+        <w:tc>
+          <w:tcPr>
+            <w:tcW w:type="dxa" w:w="3572"/>
+          </w:tcPr>
+          <w:p>
+            <w:r/>
+            <w:r>
+              <w:rPr>
+                <w:b w:val="0"/>
+                <w:sz w:val="18"/>
+              </w:rPr>
+              <w:t>Zgodne: koszt jednostkowy 125 zł/h, 13 dni, zakres w podziale 4 plus 5 plus 4.</w:t>
+            </w:r>
+          </w:p>
+        </w:tc>
+        <w:tc>
+          <w:tcPr>
+            <w:tcW w:type="dxa" w:w="4819"/>
+          </w:tcPr>
+          <w:p>
+            <w:r/>
+            <w:r>
+              <w:rPr>
+                <w:b w:val="0"/>
+                <w:sz w:val="18"/>
+              </w:rPr>
+              <w:t>Częściowo: podano źródło stawek (No Fluff Jobs), brak liczby zapytanych dostawców, bo doradca zostanie wybrany po rozeznaniu rynku. Tekst to wyjaśnia.</w:t>
+            </w:r>
+          </w:p>
+        </w:tc>
+      </w:tr>
+      <w:tr>
+        <w:tc>
+          <w:tcPr>
+            <w:tcW w:type="dxa" w:w="1361"/>
+          </w:tcPr>
+          <w:p>
+            <w:r/>
+            <w:r>
+              <w:rPr>
+                <w:b w:val="0"/>
+                <w:sz w:val="18"/>
+              </w:rPr>
+              <w:t>11-1, 11-2</w:t>
+            </w:r>
+          </w:p>
+        </w:tc>
+        <w:tc>
+          <w:tcPr>
+            <w:tcW w:type="dxa" w:w="3572"/>
+          </w:tcPr>
+          <w:p>
+            <w:r/>
+            <w:r>
+              <w:rPr>
+                <w:b w:val="0"/>
+                <w:sz w:val="18"/>
+              </w:rPr>
+              <w:t>Zgodne: zakres, jednostka, niezbędność.</w:t>
+            </w:r>
+          </w:p>
+        </w:tc>
+        <w:tc>
+          <w:tcPr>
+            <w:tcW w:type="dxa" w:w="4819"/>
+          </w:tcPr>
+          <w:p>
+            <w:r/>
+            <w:r>
+              <w:rPr>
+                <w:b w:val="0"/>
+                <w:sz w:val="18"/>
+              </w:rPr>
+              <w:t>Częściowo: podstawą jest oferta JWP z 11.06.2026 i przyjęto górną granicę przedziału. Instrukcja chce liczby zapytanych i odpowiadających kancelarii. Jeśli wysyłałaś zapytania do innych kancelarii, napisz mi nazwy i kwoty, to dopiszę. Jeśli była tylko JWP, zostaje jak jest.</w:t>
+            </w:r>
+          </w:p>
+        </w:tc>
+      </w:tr>
+      <w:tr>
+        <w:tc>
+          <w:tcPr>
+            <w:tcW w:type="dxa" w:w="1361"/>
+          </w:tcPr>
+          <w:p>
+            <w:r/>
+            <w:r>
+              <w:rPr>
+                <w:b w:val="0"/>
+                <w:sz w:val="18"/>
+              </w:rPr>
+              <w:t>11-3</w:t>
+            </w:r>
+          </w:p>
+        </w:tc>
+        <w:tc>
+          <w:tcPr>
+            <w:tcW w:type="dxa" w:w="3572"/>
+          </w:tcPr>
+          <w:p>
+            <w:r/>
+            <w:r>
+              <w:rPr>
+                <w:b w:val="0"/>
+                <w:sz w:val="18"/>
+              </w:rPr>
+              <w:t>Zgodne.</w:t>
+            </w:r>
+          </w:p>
+        </w:tc>
+        <w:tc>
+          <w:tcPr>
+            <w:tcW w:type="dxa" w:w="4819"/>
+          </w:tcPr>
+          <w:p>
+            <w:r/>
+            <w:r>
+              <w:rPr>
+                <w:b w:val="0"/>
+                <w:sz w:val="18"/>
+              </w:rPr>
+              <w:t>Zgodne: oficjalna taryfa EPO, kurs NBP z datą, bufor.</w:t>
+            </w:r>
+          </w:p>
+        </w:tc>
+      </w:tr>
+      <w:tr>
+        <w:tc>
+          <w:tcPr>
+            <w:tcW w:type="dxa" w:w="1361"/>
+          </w:tcPr>
+          <w:p>
+            <w:r/>
+            <w:r>
+              <w:rPr>
+                <w:b w:val="0"/>
+                <w:sz w:val="18"/>
+              </w:rPr>
+              <w:t>10-4, 10-5 (3.2.5)</w:t>
+            </w:r>
+          </w:p>
+        </w:tc>
+        <w:tc>
+          <w:tcPr>
+            <w:tcW w:type="dxa" w:w="3572"/>
+          </w:tcPr>
+          <w:p>
+            <w:r/>
+            <w:r>
+              <w:rPr>
+                <w:b w:val="0"/>
+                <w:sz w:val="18"/>
+              </w:rPr>
+              <w:t>Zgodne: uzasadniona liczba osób i konieczność wyjazdu.</w:t>
+            </w:r>
+          </w:p>
+        </w:tc>
+        <w:tc>
+          <w:tcPr>
+            <w:tcW w:type="dxa" w:w="4819"/>
+          </w:tcPr>
+          <w:p>
+            <w:r/>
+            <w:r>
+              <w:rPr>
+                <w:b w:val="0"/>
+                <w:sz w:val="18"/>
+              </w:rPr>
+              <w:t>Nie dotyczy: stawka jednostkowa z Przewodnika.</w:t>
+            </w:r>
+          </w:p>
+        </w:tc>
+      </w:tr>
+    </w:tbl>
+    <w:p/>
+    <w:p>
+      <w:pPr>
+        <w:pStyle w:val="Heading1"/>
+      </w:pPr>
+      <w:r>
+        <w:t>9. Dwie rzeczy do zrobienia po Twojej stronie i po co</w:t>
+      </w:r>
+    </w:p>
+    <w:tbl>
+      <w:tblPr>
+        <w:tblStyle w:val="TableGrid"/>
+        <w:tblW w:type="auto" w:w="0"/>
+        <w:tblLook w:firstColumn="1" w:firstRow="1" w:lastColumn="0" w:lastRow="0" w:noHBand="0" w:noVBand="1" w:val="04A0"/>
+      </w:tblPr>
+      <w:tblGrid>
+        <w:gridCol w:w="4819"/>
+        <w:gridCol w:w="4819"/>
+      </w:tblGrid>
+      <w:tr>
+        <w:tc>
+          <w:tcPr>
+            <w:tcW w:type="dxa" w:w="3685"/>
           </w:tcPr>
           <w:p>
             <w:r/>
@@ -4214,7 +4356,7 @@
         </w:tc>
         <w:tc>
           <w:tcPr>
-            <w:tcW w:type="dxa" w:w="2268"/>
+            <w:tcW w:type="dxa" w:w="6066"/>
           </w:tcPr>
           <w:p>
             <w:r/>
@@ -4223,7 +4365,7 @@
                 <w:b/>
                 <w:sz w:val="18"/>
               </w:rPr>
-              <w:t>Kto</w:t>
+              <w:t>Po co</w:t>
             </w:r>
           </w:p>
         </w:tc>
@@ -4231,7 +4373,7 @@
       <w:tr>
         <w:tc>
           <w:tcPr>
-            <w:tcW w:type="dxa" w:w="567"/>
+            <w:tcW w:type="dxa" w:w="3685"/>
           </w:tcPr>
           <w:p>
             <w:r/>
@@ -4240,13 +4382,13 @@
                 <w:b w:val="0"/>
                 <w:sz w:val="18"/>
               </w:rPr>
-              <w:t>1</w:t>
+              <w:t>Umowa o wykonywaniu wspólnych praw z PRz (§ 11 ust. 5) zawarta przed Z11, czyli przed 11.2028.</w:t>
             </w:r>
           </w:p>
         </w:tc>
         <w:tc>
           <w:tcPr>
-            <w:tcW w:type="dxa" w:w="6917"/>
+            <w:tcW w:type="dxa" w:w="6066"/>
           </w:tcPr>
           <w:p>
             <w:r/>
@@ -4255,13 +4397,15 @@
                 <w:b w:val="0"/>
                 <w:sz w:val="18"/>
               </w:rPr>
-              <w:t>Zachowaj korespondencję e-mail z organizatorem TRANSLOG (TEG The Events Group), w której pisze, że ceny są porównywalne z podobnymi wydarzeniami. Tekst pozycji 10-1 i 10-2 się na nią powołuje, a ekspert może zapytać o źródło szacunku. Jeśli odpowiedź organizatora zawiera jakąkolwiek kwotę, napisz mi, to dopasuję podział.</w:t>
+              <w:t>Zgłoszenie patentowe w Z11 zostanie złożone w 2028-2029 r., a prawa PRz do wyniku z Z4 przejdą na Everest11 dopiero później (oświadczenie do 28.08.2029, umowa przeniesienia do 30.11.2029). Do tego czasu wynalazek należy wspólnie do obu stron, więc Everest11 potrzebuje zgody PRz na zgłoszenie w EPO. To zamyka lukę, o którą może zapytać ekspert przy K2-02. Jeśli § 11 ust. 5 w umowie konsorcjum wygląda inaczej, niż opisałam, napisz mi, to poprawię zdanie w Z11. Nie jest to wymóg LSI, tylko zabezpieczenie spójności tekstu.</w:t>
             </w:r>
           </w:p>
         </w:tc>
+      </w:tr>
+      <w:tr>
         <w:tc>
           <w:tcPr>
-            <w:tcW w:type="dxa" w:w="2268"/>
+            <w:tcW w:type="dxa" w:w="3685"/>
           </w:tcPr>
           <w:p>
             <w:r/>
@@ -4270,15 +4414,13 @@
                 <w:b w:val="0"/>
                 <w:sz w:val="18"/>
               </w:rPr>
-              <w:t>Ty</w:t>
+              <w:t>Wniosek o zmianę PKD w KRS do 31.03.2027.</w:t>
             </w:r>
           </w:p>
         </w:tc>
-      </w:tr>
-      <w:tr>
         <w:tc>
           <w:tcPr>
-            <w:tcW w:type="dxa" w:w="567"/>
+            <w:tcW w:type="dxa" w:w="6066"/>
           </w:tcPr>
           <w:p>
             <w:r/>
@@ -4287,131 +4429,7 @@
                 <w:b w:val="0"/>
                 <w:sz w:val="18"/>
               </w:rPr>
-              <w:t>2</w:t>
-            </w:r>
-          </w:p>
-        </w:tc>
-        <w:tc>
-          <w:tcPr>
-            <w:tcW w:type="dxa" w:w="6917"/>
-          </w:tcPr>
-          <w:p>
-            <w:r/>
-            <w:r>
-              <w:rPr>
-                <w:b w:val="0"/>
-                <w:sz w:val="18"/>
-              </w:rPr>
-              <w:t>Umowa o wykonywaniu wspólnych praw z PRz (§ 11 ust. 5), zawarta przed rozpoczęciem Z11 (przed 11.2028), z upoważnieniem Everest11 do zgłoszenia w EPO, podziałem wynalazców i kosztów. Tekst Z11 zakłada takie postanowienie.</w:t>
-            </w:r>
-          </w:p>
-        </w:tc>
-        <w:tc>
-          <w:tcPr>
-            <w:tcW w:type="dxa" w:w="2268"/>
-          </w:tcPr>
-          <w:p>
-            <w:r/>
-            <w:r>
-              <w:rPr>
-                <w:b w:val="0"/>
-                <w:sz w:val="18"/>
-              </w:rPr>
-              <w:t>Ty, PRz</w:t>
-            </w:r>
-          </w:p>
-        </w:tc>
-      </w:tr>
-      <w:tr>
-        <w:tc>
-          <w:tcPr>
-            <w:tcW w:type="dxa" w:w="567"/>
-          </w:tcPr>
-          <w:p>
-            <w:r/>
-            <w:r>
-              <w:rPr>
-                <w:b w:val="0"/>
-                <w:sz w:val="18"/>
-              </w:rPr>
-              <w:t>3</w:t>
-            </w:r>
-          </w:p>
-        </w:tc>
-        <w:tc>
-          <w:tcPr>
-            <w:tcW w:type="dxa" w:w="6917"/>
-          </w:tcPr>
-          <w:p>
-            <w:r/>
-            <w:r>
-              <w:rPr>
-                <w:b w:val="0"/>
-                <w:sz w:val="18"/>
-              </w:rPr>
-              <w:t>Wniosek o zmianę wpisu PKD w KRS do 31.03.2027 (kody 62.10.B i 63.10.D). Termin jest zobowiązaniem z tekstu 3.2.1.</w:t>
-            </w:r>
-          </w:p>
-        </w:tc>
-        <w:tc>
-          <w:tcPr>
-            <w:tcW w:type="dxa" w:w="2268"/>
-          </w:tcPr>
-          <w:p>
-            <w:r/>
-            <w:r>
-              <w:rPr>
-                <w:b w:val="0"/>
-                <w:sz w:val="18"/>
-              </w:rPr>
-              <w:t>Zarząd Everest11</w:t>
-            </w:r>
-          </w:p>
-        </w:tc>
-      </w:tr>
-      <w:tr>
-        <w:tc>
-          <w:tcPr>
-            <w:tcW w:type="dxa" w:w="567"/>
-          </w:tcPr>
-          <w:p>
-            <w:r/>
-            <w:r>
-              <w:rPr>
-                <w:b w:val="0"/>
-                <w:sz w:val="18"/>
-              </w:rPr>
-              <w:t>4</w:t>
-            </w:r>
-          </w:p>
-        </w:tc>
-        <w:tc>
-          <w:tcPr>
-            <w:tcW w:type="dxa" w:w="6917"/>
-          </w:tcPr>
-          <w:p>
-            <w:r/>
-            <w:r>
-              <w:rPr>
-                <w:b w:val="0"/>
-                <w:sz w:val="18"/>
-              </w:rPr>
-              <w:t>Oświadczenie o pomocy de minimis: Everest11 nie otrzymał jej w ostatnich trzech latach obrotowych (0 zł), co jest zapisane w uzasadnieniach pozycji 10-1, 10-5 i 11-1. Przygotuj oświadczenie i formularz de minimis zgodnie z wymaganiami naboru.</w:t>
-            </w:r>
-          </w:p>
-        </w:tc>
-        <w:tc>
-          <w:tcPr>
-            <w:tcW w:type="dxa" w:w="2268"/>
-          </w:tcPr>
-          <w:p>
-            <w:r/>
-            <w:r>
-              <w:rPr>
-                <w:b w:val="0"/>
-                <w:sz w:val="18"/>
-              </w:rPr>
-              <w:t>Everest11, księgowość</w:t>
+              <w:t>Instrukcja przy pkt „Produkt wytwarzany na terytorium Polski” wymaga, jeśli w dniu składania wniosku w KRS nie ma PKD dla produktu, podania kodu i terminu planowanego wpisu. Dotychczasowy tekst miał tylko „po rozpoczęciu realizacji, przed sprzedażą”, bez daty. Podałam datę 31.03.2027. Jeśli wolisz inny termin lub dotychczasową formułę, powiedz, zmienię jedno zdanie.</w:t>
             </w:r>
           </w:p>
         </w:tc>
@@ -4423,7 +4441,7 @@
         <w:pStyle w:val="Heading1"/>
       </w:pPr>
       <w:r>
-        <w:t>9. Pokrycie uwag</w:t>
+        <w:t>10. Pokrycie uwag</w:t>
       </w:r>
     </w:p>
     <w:tbl>
@@ -4558,7 +4576,7 @@
                 <w:b w:val="0"/>
                 <w:sz w:val="18"/>
               </w:rPr>
-              <w:t>Część 3 i 5, pozycja 10-5</w:t>
+              <w:t>Części 3 i 5, pozycja 10-5</w:t>
             </w:r>
           </w:p>
         </w:tc>
@@ -4590,7 +4608,7 @@
                 <w:b w:val="0"/>
                 <w:sz w:val="18"/>
               </w:rPr>
-              <w:t>K3-59</w:t>
+              <w:t>K3-59, K3-61</w:t>
             </w:r>
           </w:p>
         </w:tc>
@@ -4652,54 +4670,7 @@
                 <w:b w:val="0"/>
                 <w:sz w:val="18"/>
               </w:rPr>
-              <w:t>Pozycja 11-3</w:t>
-            </w:r>
-          </w:p>
-        </w:tc>
-        <w:tc>
-          <w:tcPr>
-            <w:tcW w:type="dxa" w:w="2948"/>
-          </w:tcPr>
-          <w:p>
-            <w:r/>
-            <w:r>
-              <w:rPr>
-                <w:b w:val="0"/>
-                <w:sz w:val="18"/>
-              </w:rPr>
-              <w:t>Gotowe</w:t>
-            </w:r>
-          </w:p>
-        </w:tc>
-      </w:tr>
-      <w:tr>
-        <w:tc>
-          <w:tcPr>
-            <w:tcW w:type="dxa" w:w="1701"/>
-          </w:tcPr>
-          <w:p>
-            <w:r/>
-            <w:r>
-              <w:rPr>
-                <w:b w:val="0"/>
-                <w:sz w:val="18"/>
-              </w:rPr>
-              <w:t>K3-61</w:t>
-            </w:r>
-          </w:p>
-        </w:tc>
-        <w:tc>
-          <w:tcPr>
-            <w:tcW w:type="dxa" w:w="5102"/>
-          </w:tcPr>
-          <w:p>
-            <w:r/>
-            <w:r>
-              <w:rPr>
-                <w:b w:val="0"/>
-                <w:sz w:val="18"/>
-              </w:rPr>
-              <w:t>Część 4, metody szacowania</w:t>
+              <w:t>Pozycje 10-1, 10-2, 11-3</w:t>
             </w:r>
           </w:p>
         </w:tc>
@@ -4855,7 +4826,7 @@
                 <w:b w:val="0"/>
                 <w:sz w:val="18"/>
               </w:rPr>
-              <w:t>Gotowe, podział jest oszacowaniem</w:t>
+              <w:t>Gotowe</w:t>
             </w:r>
           </w:p>
         </w:tc>

</xml_diff>

<commit_message>
WP09: pełne zdania, czas przyszły, budżet 86 871/43 435,50 bez zmian vs poprzednia wersja
Co-Authored-By: Claude Sonnet 5.5 <noreply@anthropic.com>
Claude-Session: https://claude.ai/code/session_01672WnJhixnEcarbb7uiwfx
</commit_message>
<xml_diff>
--- a/Sekcja_3.2_internacjonalizacja_Z10_Z11.docx
+++ b/Sekcja_3.2_internacjonalizacja_Z10_Z11.docx
@@ -255,7 +255,7 @@
                 <w:b w:val="0"/>
                 <w:sz w:val="18"/>
               </w:rPr>
-              <w:t>Pakiet 24 000 zł rozdzielony na powierzchnię i opłatę podstawową (de minimis, 5.3.8: 13 783 zł) oraz energię, zabudowę i meble (art. 19, 5.3.2: 10 217 zł). Podział i kwoty wynikają z cennika historycznego kongresu (stoisko narożne 9 m², górne granice zakresów, kurs NBP 4,2836, waloryzacja ok. 10,4%).</w:t>
+              <w:t>Pakiet 24 000 zł rozdzielony na powierzchnię i opłatę podstawową (de minimis, 5.3.8: 13 735 zł) oraz energię, zabudowę i meble (art. 19, 5.3.2: 10 184 zł), razem 23 919 zł. Kwoty wynikają z cennika historycznego kongresu: stoisko narożne 9 m², górne granice zakresów cen, kurs NBP 4,2836, waloryzacja ok. 10%.</w:t>
             </w:r>
           </w:p>
         </w:tc>
@@ -423,7 +423,7 @@
           <w:color w:val="666666"/>
           <w:sz w:val="17"/>
         </w:rPr>
-        <w:t xml:space="preserve"> [1992 znaków]</w:t>
+        <w:t xml:space="preserve"> [1987 znaków]</w:t>
       </w:r>
     </w:p>
     <w:p>
@@ -434,7 +434,7 @@
         <w:rPr>
           <w:b w:val="0"/>
         </w:rPr>
-        <w:t>Tak. CargoDT będzie wytwarzany w Polsce przez osoby zatrudnione w Polsce, co spełnia warunek nr 2 z Instrukcji.</w:t>
+        <w:t>CargoDT będzie wytwarzany w Polsce przez osoby zatrudnione w Polsce, co spełnia warunek nr 2 z Instrukcji.</w:t>
       </w:r>
     </w:p>
     <w:p>
@@ -445,7 +445,7 @@
         <w:rPr>
           <w:b w:val="0"/>
         </w:rPr>
-        <w:t>Oprogramowanie. Modele AI, pipeline inferencyjny na platformie embedded, generator dokumentów PoL i PoC, integracje eFTI i e-CMR, API oraz platformę SaaS będą opracowywać i utrzymywać pracownicy Everest11: zespół AI, IT i cyberbezpieczeństwa.</w:t>
+        <w:t>Oprogramowanie CargoDT, czyli modele AI, pipeline inferencyjny na platformie embedded, generator dokumentów PoL i PoC, integracje eFTI i e-CMR, API oraz platformę SaaS, będą opracowywać i utrzymywać pracownicy Everest11 z zespołów AI i IT.</w:t>
       </w:r>
     </w:p>
     <w:p>
@@ -456,7 +456,7 @@
         <w:rPr>
           <w:b w:val="0"/>
         </w:rPr>
-        <w:t>Część sprzętowa. Everest11 nie będzie produkować komponentów elektronicznych. Kamery, radar, platformę obliczeniową, zasilanie i obudowy kupi jako gotowe produkty komercyjne. Zestaw będzie powstawał w Polsce w trzech krokach, a wszystkie wykonają pracownicy Everest11. 1) Integracja i konfiguracja: oprogramowanie sterujące, kalibracja kamer i radaru. 2) Kompletacja: montaż kupionych komponentów w zestaw i test odbiorczy. 3) Instalacja w naczepie klienta, uruchomienie i serwis. Kompletację i montaż będzie prowadzić IoT Specialist, od 2033 r. z kolejnymi technikami. Pierwszą serię zestawów, 50 sztuk w 2029 r., Everest11 skompletuje własnym zespołem w małej serii. Kompletacja pozostanie w Everest11 także przy większych seriach po 2031 r., w wynajętej powierzchni magazynowo-montażowej w Polsce. W samym projekcie montaż prototypów w Z2 i Z9 wykona podwykonawca pod nadzorem IoT Specialist, ale dotyczy to egzemplarzy badawczych, a nie wytwarzania produktu handlowego.</w:t>
+        <w:t>W części sprzętowej Everest11 nie będzie produkować komponentów elektronicznych, tylko kupi kamery, radar, platformę obliczeniową, zasilanie i obudowy jako gotowe produkty komercyjne. Zestaw będzie powstawał w Polsce w trzech krokach, które wykonają pracownicy Everest11: najpierw zostaną zintegrowane i skonfigurowane komponenty, czyli oprogramowanie sterujące oraz kalibracja kamer i radaru, następnie zespół skompletuje zestaw z kupionych komponentów i wykona test odbiorczy, a na końcu zestaw zostanie zainstalowany w naczepie klienta, uruchomiony i objęty serwisem. Kompletację i montaż będzie prowadzić IoT Specialist, od 2033 r. wraz z kolejnymi technikami. Pierwszą serię 50 zestawów w 2029 r. Everest11 skompletuje własnym zespołem, a przy większych seriach po 2031 r. kompletacja pozostanie w Everest11, w wynajętej powierzchni magazynowo-montażowej w Polsce. W projekcie montaż prototypów w Z2 i Z9 wykona podwykonawca pod nadzorem IoT Specialist, ale dotyczy to egzemplarzy badawczych, a nie produktu handlowego.</w:t>
       </w:r>
     </w:p>
     <w:p>
@@ -467,7 +467,7 @@
         <w:rPr>
           <w:b w:val="0"/>
         </w:rPr>
-        <w:t>Usługa. Subskrypcję SaaS i wsparcie techniczne będzie świadczył zespół Everest11 w Polsce. Platforma będzie działać w chmurze, obsługiwana przez pracowników zatrudnionych w Polsce (usługa zdalna).</w:t>
+        <w:t>Subskrypcję SaaS i wsparcie techniczne będzie świadczył zespół Everest11 w Polsce, a platforma będzie działać w chmurze i obsługiwać ją będą pracownicy zatrudnieni w Polsce (usługa zdalna).</w:t>
       </w:r>
     </w:p>
     <w:p>
@@ -478,7 +478,7 @@
         <w:rPr>
           <w:b w:val="0"/>
         </w:rPr>
-        <w:t>PKD. W dniu złożenia wniosku w KRS Everest11 nie ma kodu PKD dla działalności produktowej, bo zostanie ona uruchomiona w wyniku projektu. Planowane kody według PKD 2025 (rozporządzenie Rady Ministrów z 18.12.2024, Dz.U. 2024 poz. 1936): 62.10.B Pozostała działalność w zakresie programowania oraz 63.10.D, usługi infrastruktury obliczeniowej i przetwarzania danych. Wniosek o zmianę wpisu zostanie złożony do 31.03.2027, czyli przed sprzedażą pierwszych egzemplarzy.</w:t>
+        <w:t>W dniu złożenia wniosku Everest11 nie ma w KRS kodu PKD dla działalności produktowej, ponieważ zostanie ona uruchomiona w wyniku projektu. Planowane kody według PKD 2025 (Dz.U. 2024 poz. 1936) to 62.10.B Pozostała działalność w zakresie programowania oraz 63.10.D, usługi infrastruktury obliczeniowej i przetwarzania danych. Wniosek o zmianę wpisu zostanie złożony do 31.03.2027, czyli przed sprzedażą pierwszych egzemplarzy.</w:t>
       </w:r>
     </w:p>
     <w:p>
@@ -506,7 +506,7 @@
           <w:color w:val="666666"/>
           <w:sz w:val="17"/>
         </w:rPr>
-        <w:t xml:space="preserve"> [1844 znaków]</w:t>
+        <w:t xml:space="preserve"> [1892 znaków]</w:t>
       </w:r>
     </w:p>
     <w:p>
@@ -517,7 +517,7 @@
         <w:rPr>
           <w:b w:val="0"/>
         </w:rPr>
-        <w:t>Rynkiem docelowym CargoDT będzie Polska, a promocja zagraniczna obejmie Czechy, Słowację, Węgry i Rumunię. Wybór wynika z trzech powodów.</w:t>
+        <w:t>Rynkiem docelowym CargoDT będzie Polska, a promocja zagraniczna obejmie Czechy, Słowację, Węgry i Rumunię. Wybór tych krajów wynika z trzech powodów.</w:t>
       </w:r>
     </w:p>
     <w:p>
@@ -539,7 +539,7 @@
         <w:rPr>
           <w:b w:val="0"/>
         </w:rPr>
-        <w:t>Po drugie, rozporządzenie eFTI (UE) 2020/1056 obowiązuje w całej Unii. Od 21.08.2025 organy państw członkowskich muszą przyjmować dane przewozowe w formacie eFTI, a przewoźnicy mogą z tej drogi korzystać dobrowolnie. Dokument Proof of Condition w formacie eFTI będzie więc działał w każdym z tych krajów bez zmian.</w:t>
+        <w:t>Po drugie, rozporządzenie eFTI (UE) 2020/1056 obowiązuje w całej Unii. Od 21.08.2025 organy państw członkowskich muszą przyjmować dane przewozowe w formacie eFTI, a przewoźnicy mogą z tej drogi korzystać dobrowolnie, więc dokument Proof of Condition w formacie eFTI będzie działał w każdym z tych krajów bez zmian.</w:t>
       </w:r>
     </w:p>
     <w:p>
@@ -550,7 +550,7 @@
         <w:rPr>
           <w:b w:val="0"/>
         </w:rPr>
-        <w:t>Po trzecie, CargoDT wejdzie na te rynki bez lokalnej obecności: przez licencje API dla lokalnych dostawców TMS i przez giełdy transportowe, z którymi Everest11 jest już zintegrowane, czyli Trans.eu i TimoCom. Konkurencyjne oferty to rozwiązania fabryczne w nowych naczepach i systemy aftermarket bez modelu 3D przestrzeni ładunkowej (pkt 1.2), więc retrofit dla MŚP w subskrypcji będzie ofertą uzupełniającą.</w:t>
+        <w:t>Po trzecie, CargoDT wejdzie na te rynki bez lokalnej obecności, przez licencje API dla lokalnych dostawców TMS i przez giełdy transportowe, z którymi Everest11 jest już zintegrowane, czyli Trans.eu i TimoCom. Konkurencyjne oferty to rozwiązania fabryczne w nowych naczepach i systemy aftermarket bez modelu 3D przestrzeni ładunkowej (pkt 1.2), więc retrofit dla MŚP w subskrypcji będzie ofertą uzupełniającą.</w:t>
       </w:r>
     </w:p>
     <w:p>
@@ -561,7 +561,7 @@
         <w:rPr>
           <w:b w:val="0"/>
         </w:rPr>
-        <w:t>Sposób promocji. Podstawowym działaniem będzie udział Everest11 w TRANSLOG Connect Congress w Budapeszcie w listopadzie 2028 r. To coroczny kongres branży TSL w Europie Środkowo-Wschodniej, na którym wystawcy prowadzą spotkania B2B z dostawcami oprogramowania i logistyki. Uzupełnią go: jedna wyjazdowa misja gospodarcza do Czech w 2029 r., na której Everest11 spotka się z lokalnymi dostawcami TMS, oraz usługi doradcze: analiza rynków, model partnerstw i licencji API. Misja i doradztwo nie będą jedynymi działaniami, bo kongres jest wydarzeniem wiodącym.</w:t>
+        <w:t>Podstawowym działaniem promocyjnym będzie udział Everest11 w TRANSLOG Connect Congress w Budapeszcie w listopadzie 2028 r., czyli w corocznym kongresie branży TSL w Europie Środkowo-Wschodniej, na którym wystawcy prowadzą spotkania B2B z dostawcami oprogramowania i logistyki. Uzupełnią go jedna wyjazdowa misja gospodarcza do Czech w 2029 r., podczas której Everest11 spotka się z lokalnymi dostawcami TMS, oraz usługi doradcze obejmujące analizę rynków, model partnerstw i licencji API. Misja i doradztwo nie będą jedynymi działaniami, bo kongres jest wydarzeniem wiodącym.</w:t>
       </w:r>
     </w:p>
     <w:p>
@@ -572,7 +572,7 @@
         <w:rPr>
           <w:b w:val="0"/>
         </w:rPr>
-        <w:t>Cel handlowy: listy intencyjne z co najmniej 2 dostawcami TMS lub giełdami w regionie CEE jako podstawa licencji API od 2032 r. W 2030 r., pierwszym roku sprzedaży, sprzedaż trafi do klientów w Polsce, więc przychody poza RP w tym roku nie wystąpią, o czym mówi wskaźnik w sekcji 8.2.</w:t>
+        <w:t>Celem handlowym są listy intencyjne z co najmniej dwoma dostawcami TMS lub giełdami w regionie CEE, jako podstawa licencji API od 2032 r. W 2030 r., czyli w pierwszym roku sprzedaży, sprzedaż trafi do klientów w Polsce, więc przychody poza RP w tym roku nie wystąpią, o czym mówi wskaźnik w sekcji 8.2.</w:t>
       </w:r>
     </w:p>
     <w:p>
@@ -608,7 +608,7 @@
           <w:color w:val="666666"/>
           <w:sz w:val="17"/>
         </w:rPr>
-        <w:t xml:space="preserve"> [2704 znaków]</w:t>
+        <w:t xml:space="preserve"> [2960 znaków]</w:t>
       </w:r>
     </w:p>
     <w:p>
@@ -619,7 +619,7 @@
         <w:rPr>
           <w:b w:val="0"/>
         </w:rPr>
-        <w:t>Zadanie dotyczy umiędzynarodowienia produktu CargoDT: promocji w regionie CEE i pozyskania partnerów, którzy zintegrują CargoDT przez API ze swoimi systemami TMS. Zadanie zrealizuje Everest11. Produkt będzie wytwarzany w Polsce (pkt 3.2.1).</w:t>
+        <w:t>Zadanie dotyczy umiędzynarodowienia produktu CargoDT, czyli promocji w regionie CEE i pozyskania partnerów, którzy zintegrują CargoDT przez API ze swoimi systemami TMS. Zadanie zrealizuje Everest11, a produkt będzie wytwarzany w Polsce (pkt 3.2.1).</w:t>
       </w:r>
     </w:p>
     <w:p>
@@ -630,7 +630,7 @@
         <w:rPr>
           <w:b w:val="0"/>
         </w:rPr>
-        <w:t>Zakres.</w:t>
+        <w:t>Zakres zadania obejmie trzy działania. Pierwszym będzie udział w TRANSLOG Connect Congress w Budapeszcie w listopadzie 2028 r. w roli wystawcy, czyli stoisko z elementem wizualizacji CargoDT, prezentacja prototypu z wynikami walidacji z Z9 i spotkania B2B z dostawcami TMS oraz giełdami transportowymi, a kongres będzie wydarzeniem podstawowym zadania. Drugim będzie zagraniczna misja wyjazdowa do Czech w okresie od stycznia do kwietnia 2029 r., podczas której odbędą się spotkania z lokalnymi dostawcami TMS i potencjalnymi partnerami licencyjnymi. Organizatora lub formułę misji Everest11 wybierze do końca 2028 r., a wyjazd odbędzie się przed 30.04.2029. Trzecim będą usługi doradcze zewnętrznego doradcy w wymiarze 14 dni: analiza rynków CEE pod kątem wymagań regulacyjnych i kanałów sprzedaży, model partnerstw z dostawcami TMS i licencji API oraz przygotowanie materiałów do rozmów. Doradztwo będzie jednorazowe, nie będzie miało charakteru ciągłego i nie obejmie bieżącej działalności.</w:t>
       </w:r>
     </w:p>
     <w:p>
@@ -641,7 +641,7 @@
         <w:rPr>
           <w:b w:val="0"/>
         </w:rPr>
-        <w:t>1) Udział w TRANSLOG Connect Congress w Budapeszcie, listopad 2028 r., w roli wystawcy: stoisko z elementem wizualizacji CargoDT, prezentacja prototypu z wynikami walidacji z Z9 i spotkania B2B z dostawcami TMS oraz giełdami transportowymi. Kongres będzie wydarzeniem podstawowym zadania.</w:t>
+        <w:t>Na kongres pojadą dwie osoby: kierownik zarządzający, który będzie reprezentował Lidera i podejmował wstępne ustalenia, oraz specjalista ds. logistyki TSL, który poprowadzi spotkania handlowe i zaprezentuje scenariusze operacyjne. Dwie osoby będą potrzebne, bo w trakcie dwudniowego kongresu na stoisku równolegle będą trwały spotkania 1:1 i prezentacje. Na misję pojedzie specjalista ds. logistyki TSL. Obie osoby są zatrudnione w Everest11 i będą pracować w projekcie.</w:t>
       </w:r>
     </w:p>
     <w:p>
@@ -652,7 +652,7 @@
         <w:rPr>
           <w:b w:val="0"/>
         </w:rPr>
-        <w:t>2) Zagraniczna misja wyjazdowa do Czech, I-IV 2029 r.: spotkania z lokalnymi dostawcami TMS i potencjalnymi partnerami licencyjnymi. Organizatora lub formułę misji Everest11 wybierze do końca 2028 r., a wyjazd odbędzie się przed 30.04.2029.</w:t>
+        <w:t>Wydatki zostaną rozliczone zgodnie z Przewodnikiem kwalifikowalności. Opłata za powierzchnię stoiska i opłata podstawowa to pomoc de minimis (5.3.8), energia, zabudowa i meble to art. 19 GBER (5.3.2), a zabudowa wizualna stoiska to art. 19 GBER (5.3.1). Podróże zostaną rozliczone stawką jednostkową 5 489 zł na osobę dla Europy, na kongres jako art. 19 GBER (5.3.3), a na misję jako de minimis (5.3.4). Doradztwo to art. 18 GBER (5.3.7). Wydatki internacjonalizacyjne Everest11 wyniosą ok. 2,15% jego kosztów prac B+R, przy limicie 15%.</w:t>
       </w:r>
     </w:p>
     <w:p>
@@ -663,7 +663,7 @@
         <w:rPr>
           <w:b w:val="0"/>
         </w:rPr>
-        <w:t>3) Usługi doradcze zewnętrznego doradcy, 13 dni: analiza rynków CEE pod kątem wymagań regulacyjnych i kanałów sprzedaży, model partnerstw z dostawcami TMS i licencji API, przygotowanie materiałów do rozmów. Doradztwo będzie jednorazowe, nie będzie miało charakteru ciągłego i nie obejmie bieżącej działalności.</w:t>
+        <w:t>Rezultatem i kamieniem milowym zadania będzie udział w kongresie jako wystawca, co najmniej jedna misja, co najmniej pięć rozmów z dostawcami TMS lub giełdami potwierdzonych notatkami ze spotkań, w tym listy intencyjne z co najmniej dwoma z nich dotyczące licencji API, oraz raport doradcy z modelem partnerstw. Osiągnięcie kamienia milowego zostanie zweryfikowane listą wystawców organizatora, dokumentacją zdjęciową stoiska, notatkami i raportem doradcy.</w:t>
       </w:r>
     </w:p>
     <w:p>
@@ -674,40 +674,7 @@
         <w:rPr>
           <w:b w:val="0"/>
         </w:rPr>
-        <w:t>Delegaci. Na kongres pojadą dwie osoby: kierownik zarządzający, który będzie reprezentować Lidera i podejmować wstępne ustalenia, oraz specjalista ds. logistyki TSL, który poprowadzi spotkania handlowe i zaprezentuje scenariusze operacyjne. Dwie osoby będą potrzebne, bo na stoisku w trakcie dwudniowego kongresu równolegle będą trwać spotkania 1:1 i prezentacje. Na misję pojedzie specjalista ds. logistyki TSL. Obie osoby są zatrudnione w Everest11 i będą pracować w projekcie.</w:t>
-      </w:r>
-    </w:p>
-    <w:p>
-      <w:pPr>
-        <w:spacing w:after="60"/>
-      </w:pPr>
-      <w:r>
-        <w:rPr>
-          <w:b w:val="0"/>
-        </w:rPr>
-        <w:t>Finansowanie i pomoc. Pakiet wystawcy zostanie rozliczony jako opłata za powierzchnię i opłata podstawowa (pomoc de minimis, Przewodnik 5.3.8) oraz energia, zabudowa i meble (art. 19 GBER, 5.3.2). Zabudowa wizualna stoiska to art. 19 GBER (5.3.1). Podróże zostaną rozliczone stawką jednostkową 5 489 zł na osobę dla Europy: na kongres jako art. 19 GBER (5.3.3), na misję jako de minimis (5.3.4). Doradztwo to art. 18 GBER (5.3.7). Wydatki internacjonalizacyjne Everest11 wyniosą ok. 2,1% jego kosztów prac B+R, a limit to 15%.</w:t>
-      </w:r>
-    </w:p>
-    <w:p>
-      <w:pPr>
-        <w:spacing w:after="60"/>
-      </w:pPr>
-      <w:r>
-        <w:rPr>
-          <w:b w:val="0"/>
-        </w:rPr>
-        <w:t>Rezultat i kamień milowy. Udział w kongresie jako wystawca, co najmniej 1 misja, co najmniej 5 rozmów z dostawcami TMS lub giełdami potwierdzonych notatkami ze spotkań, w tym listy intencyjne z co najmniej 2 z nich dotyczące licencji API, oraz raport doradcy z modelem partnerstw. Weryfikacja: lista wystawców organizatora, dokumentacja zdjęciowa stoiska, notatki i raport doradcy.</w:t>
-      </w:r>
-    </w:p>
-    <w:p>
-      <w:pPr>
-        <w:spacing w:after="60"/>
-      </w:pPr>
-      <w:r>
-        <w:rPr>
-          <w:b w:val="0"/>
-        </w:rPr>
-        <w:t>Ryzyko. Odwołanie lub zmiana terminu kongresu przez organizatora. Wtedy Everest11 wybierze porównywalne wydarzenie branżowe w regionie CEE w tym samym okresie kwalifikowalności i zgłosi zmianę w trybie umowy o dofinansowanie.</w:t>
+        <w:t>Głównym ryzykiem jest odwołanie lub zmiana terminu kongresu przez organizatora. W takim przypadku Everest11 wybierze porównywalne wydarzenie branżowe w regionie CEE w tym samym okresie kwalifikowalności i zgłosi zmianę w trybie umowy o dofinansowanie.</w:t>
       </w:r>
     </w:p>
     <w:p>
@@ -735,7 +702,7 @@
           <w:color w:val="666666"/>
           <w:sz w:val="17"/>
         </w:rPr>
-        <w:t xml:space="preserve"> [2455 znaków]</w:t>
+        <w:t xml:space="preserve"> [2589 znaków]</w:t>
       </w:r>
     </w:p>
     <w:p>
@@ -746,7 +713,7 @@
         <w:rPr>
           <w:b w:val="0"/>
         </w:rPr>
-        <w:t>Zadanie dotyczy uzyskania ochrony praw własności przemysłowej. Everest11 zgłosi w procedurze europejskiej przed Europejskim Urzędem Patentowym (EPO) wynalazek: metodę i system predykcji ryzyka uszkodzenia ładunku w transporcie drogowym na podstawie wielomodalnych sygnałów środowiskowych in-transit. Wynalazek jest wynikiem prac Z4 i zostanie potwierdzony danymi terenowymi z Z9.</w:t>
+        <w:t>Zadanie dotyczy uzyskania ochrony praw własności przemysłowej. Everest11 zgłosi w procedurze europejskiej przed Europejskim Urzędem Patentowym (EPO) wynalazek, którym jest metoda i system predykcji ryzyka uszkodzenia ładunku w transporcie drogowym na podstawie wielomodalnych sygnałów środowiskowych in-transit. Wynalazek jest wynikiem prac Z4 i zostanie potwierdzony danymi terenowymi z Z9.</w:t>
       </w:r>
     </w:p>
     <w:p>
@@ -757,7 +724,7 @@
         <w:rPr>
           <w:b w:val="0"/>
         </w:rPr>
-        <w:t>Zakres w projekcie obejmie czynności do złożenia zgłoszenia.</w:t>
+        <w:t>Zakres w projekcie obejmie czynności do złożenia zgłoszenia. Rzecznik patentowy wyda wstępne orzeczenie o zdolności patentowej wynalazku, a zgodnie z Przewodnikiem koszt orzeczenia jest kwalifikowalny, jeśli orzeczenie będzie pozytywne. Następnie rzecznik z zespołem B+R przygotuje dokumentację zgłoszeniową, czyli opis wynalazku, zastrzeżenia i rysunki, a w razie potrzeby zostaną wykonane tłumaczenia dokumentacji. Na końcu Everest11 złoży zgłoszenie w EPO i wniesie opłaty urzędowe: zgłoszeniową i za poszukiwanie europejskie. Rzecznik będzie podwykonawcą Everest11, a koncepcja wynalazku i zastrzeżenia pozostaną po stronie konsorcjum. Poszukiwania stanu techniki w Z1 i Z11 nie będą się dublować, ponieważ Z1 dotyczy stanu techniki do projektowania systemu, a rzecznik w Z11 oceni zdolność patentową konkretnego wynalazku.</w:t>
       </w:r>
     </w:p>
     <w:p>
@@ -768,7 +735,7 @@
         <w:rPr>
           <w:b w:val="0"/>
         </w:rPr>
-        <w:t>1) Wstępne orzeczenie rzecznika patentowego o zdolności patentowej wynalazku. Zgodnie z Przewodnikiem koszt jest kwalifikowalny, jeśli orzeczenie będzie pozytywne.</w:t>
+        <w:t>Prawa do wyniku Z4 będą przysługiwać PRz i Everest11 stosownie do wkładu (§ 11 umowy konsorcjum). Przed rozpoczęciem Z11 strony zawrą umowę o wykonywaniu wspólnych praw (§ 11 ust. 5), w której PRz upoważni Everest11 do dokonania zgłoszenia i ustali podział wynalazców. Przeniesienie praw majątkowych PRz na Lidera za wynagrodzeniem według wyceny niezależnego eksperta nastąpi według § 11: oświadczenie Lidera zostanie złożone najpóźniej do 28.08.2029, a umowa przeniesienia zostanie zawarta do 30.11.2029. Szczegóły opisano w pkt 2.2.</w:t>
       </w:r>
     </w:p>
     <w:p>
@@ -779,7 +746,7 @@
         <w:rPr>
           <w:b w:val="0"/>
         </w:rPr>
-        <w:t>2) Dokumentacja zgłoszeniowa przygotowana przez rzecznika patentowego z zespołem B+R: opis wynalazku, zastrzeżenia, rysunki.</w:t>
+        <w:t>Dalsze etapy procedury EPO, czyli publikacja po ok. 18 miesiącach, badanie merytoryczne, udzielenie i walidacja krajowa, zwykle trwają kilka lat i wykraczają poza projekt. Udzielenie patentu nie będzie warunkiem zakończenia zadania, co jest zgodne ze wskaźnikiem produktu dla zgłoszeń, a koszty tych etapów Everest11 poniesie ze środków własnych.</w:t>
       </w:r>
     </w:p>
     <w:p>
@@ -790,7 +757,7 @@
         <w:rPr>
           <w:b w:val="0"/>
         </w:rPr>
-        <w:t>3) Tłumaczenia dokumentacji, jeśli wymaga ich procedura.</w:t>
+        <w:t>Rezultatem i kamieniem milowym zadania będzie zgłoszenie EPO z numerem i datą pierwszeństwa, złożone przed ujawnieniem produktu, oraz pozytywne orzeczenie rzecznika o zdolności patentowej, w terminie M29, czyli w kwietniu 2029 r.</w:t>
       </w:r>
     </w:p>
     <w:p>
@@ -801,62 +768,7 @@
         <w:rPr>
           <w:b w:val="0"/>
         </w:rPr>
-        <w:t>4) Złożenie zgłoszenia w EPO i opłaty urzędowe: zgłoszeniowa i za poszukiwanie europejskie.</w:t>
-      </w:r>
-    </w:p>
-    <w:p>
-      <w:pPr>
-        <w:spacing w:after="60"/>
-      </w:pPr>
-      <w:r>
-        <w:rPr>
-          <w:b w:val="0"/>
-        </w:rPr>
-        <w:t>Rzecznik będzie podwykonawcą Everest11. Koncepcja wynalazku i zastrzeżenia pozostaną po stronie konsorcjum. Poszukiwania stanu techniki w Z1 i Z11 nie będą się dublować: Z1 dotyczy stanu techniki do projektowania systemu, a rzecznik w Z11 oceni zdolność patentową konkretnego wynalazku.</w:t>
-      </w:r>
-    </w:p>
-    <w:p>
-      <w:pPr>
-        <w:spacing w:after="60"/>
-      </w:pPr>
-      <w:r>
-        <w:rPr>
-          <w:b w:val="0"/>
-        </w:rPr>
-        <w:t>Prawo do zgłoszenia. Prawa do wyniku Z4 będą przysługiwać PRz i Everest11 stosownie do wkładu (§ 11 umowy konsorcjum). Przed rozpoczęciem Z11 strony zawrą umowę o wykonywaniu wspólnych praw (§ 11 ust. 5), w której PRz upoważni Everest11 do dokonania zgłoszenia i ustali podział wynalazców. Przeniesienie praw majątkowych PRz na Lidera za wynagrodzeniem według wyceny niezależnego eksperta nastąpi według § 11: oświadczenie Lidera najpóźniej do 28.08.2029, a umowa przeniesienia do 30.11.2029. Szczegóły opisano w pkt 2.2.</w:t>
-      </w:r>
-    </w:p>
-    <w:p>
-      <w:pPr>
-        <w:spacing w:after="60"/>
-      </w:pPr>
-      <w:r>
-        <w:rPr>
-          <w:b w:val="0"/>
-        </w:rPr>
-        <w:t>Dalsze etapy procedury EPO, czyli publikacja po ok. 18 miesiącach, badanie merytoryczne, udzielenie i walidacja krajowa, trwają zwykle kilka lat i wykraczają poza projekt. Udzielenie patentu nie będzie warunkiem zakończenia zadania, co jest zgodne ze wskaźnikiem produktu dla zgłoszeń. Koszty tych etapów Everest11 poniesie ze środków własnych.</w:t>
-      </w:r>
-    </w:p>
-    <w:p>
-      <w:pPr>
-        <w:spacing w:after="60"/>
-      </w:pPr>
-      <w:r>
-        <w:rPr>
-          <w:b w:val="0"/>
-        </w:rPr>
-        <w:t>Rezultat i kamień milowy. Zgłoszenie EPO z numerem i datą pierwszeństwa, złożone przed ujawnieniem produktu, oraz pozytywne orzeczenie rzecznika o zdolności patentowej. Termin: M29, 04.2029.</w:t>
-      </w:r>
-    </w:p>
-    <w:p>
-      <w:pPr>
-        <w:spacing w:after="60"/>
-      </w:pPr>
-      <w:r>
-        <w:rPr>
-          <w:b w:val="0"/>
-        </w:rPr>
-        <w:t>Ryzyko. Negatywne orzeczenie rzecznika. Wtedy Everest11 zrezygnuje ze zgłoszenia, koszt orzeczenia będzie niekwalifikowalny, a ochronę zapewni tajemnica przedsiębiorstwa dla wag modeli i kodu oraz prawa autorskie do oprogramowania.</w:t>
+        <w:t>Głównym ryzykiem jest negatywne orzeczenie rzecznika. W takim przypadku Everest11 zrezygnuje ze zgłoszenia, koszt orzeczenia będzie niekwalifikowalny, a ochronę zapewni tajemnica przedsiębiorstwa dla wag modeli i kodu oraz prawa autorskie do oprogramowania.</w:t>
       </w:r>
     </w:p>
     <w:p>
@@ -1072,7 +984,7 @@
                 <w:b w:val="0"/>
                 <w:sz w:val="18"/>
               </w:rPr>
-              <w:t>16 953,09</w:t>
+              <w:t>16 894,05</w:t>
             </w:r>
           </w:p>
         </w:tc>
@@ -1087,7 +999,7 @@
                 <w:b w:val="0"/>
                 <w:sz w:val="18"/>
               </w:rPr>
-              <w:t>13 783,00</w:t>
+              <w:t>13 735,00</w:t>
             </w:r>
           </w:p>
         </w:tc>
@@ -1179,7 +1091,7 @@
                 <w:b w:val="0"/>
                 <w:sz w:val="18"/>
               </w:rPr>
-              <w:t>12 566,91</w:t>
+              <w:t>12 526,32</w:t>
             </w:r>
           </w:p>
         </w:tc>
@@ -1194,7 +1106,7 @@
                 <w:b w:val="0"/>
                 <w:sz w:val="18"/>
               </w:rPr>
-              <w:t>10 217,00</w:t>
+              <w:t>10 184,00</w:t>
             </w:r>
           </w:p>
         </w:tc>
@@ -1607,7 +1519,7 @@
                 <w:b w:val="0"/>
                 <w:sz w:val="18"/>
               </w:rPr>
-              <w:t>15 990,00</w:t>
+              <w:t>17 220,00</w:t>
             </w:r>
           </w:p>
         </w:tc>
@@ -1622,7 +1534,7 @@
                 <w:b w:val="0"/>
                 <w:sz w:val="18"/>
               </w:rPr>
-              <w:t>13 000,00</w:t>
+              <w:t>14 000,00</w:t>
             </w:r>
           </w:p>
         </w:tc>
@@ -1973,7 +1885,7 @@
         <w:rPr>
           <w:b w:val="0"/>
         </w:rPr>
-        <w:t>Pozycje 10-4 i 10-5 wprowadzasz w pkt 3.2.5 jako koszty uproszczone, nie w 3.2.3. Pozycje 10-1 i 10-2 razem dają 24 000,00 zł kwalifikowalnych, czyli pakiet wystawcy.</w:t>
+        <w:t>Pozycje 10-4 i 10-5 wprowadzasz w pkt 3.2.5 jako koszty uproszczone, nie w 3.2.3. Pozycje 10-1 i 10-2 razem dają 23 919,00 zł kwalifikowalnych.</w:t>
       </w:r>
     </w:p>
     <w:p>
@@ -1984,7 +1896,7 @@
         <w:rPr>
           <w:b w:val="0"/>
         </w:rPr>
-        <w:t>Suma internacjonalizacji po zmianach: kwalifikowalne 85 952,00 zł (przed zmianą 86 871,00 zł), ogółem 100 143,00 zł (przed zmianą 104 075,78 zł), dofinansowanie 50%, czyli 42 976,00 zł (przed zmianą 43 435,50 zł). Dofinansowanie spada o 459,50 zł, więc nie rośnie. Udział w kosztach prac B+R Everest11 wynosi ok. 2,1% przy limicie 15%.</w:t>
+        <w:t>Suma internacjonalizacji po zmianach: kwalifikowalne 86 871,00 zł, dofinansowanie 50%, czyli 43 435,50 zł. Obie kwoty są identyczne jak w obecnym wniosku (86 871,00 zł i 43 435,50 zł), więc budżet i dofinansowanie nie zmieniają się. Udział w kosztach prac B+R Everest11 pozostaje 2,15% przy limicie 15%. Wydatki ogółem wynoszą 101 273,37 zł, a w obecnym wniosku 104 075,78 zł. Różnica 2 802,41 zł wynika ze struktury VAT: w nowym budżecie pozycje bez VAT to stawki jednostkowe podróży (16 467 zł, netto równe brutto) i opłaty EPO (7 785 zł), razem 24 252 zł, a w obecnym wniosku podróże liczono z VAT, a tłumaczeniom (3 500 zł) VAT pominięto. Wydatki ogółem są kwotą pochodną i nie wpływają na dofinansowanie.</w:t>
       </w:r>
     </w:p>
     <w:p>
@@ -2018,7 +1930,7 @@
         <w:rPr>
           <w:b w:val="0"/>
         </w:rPr>
-        <w:t>13 783,00 zł netto.</w:t>
+        <w:t>13 735,00 zł netto.</w:t>
       </w:r>
     </w:p>
     <w:p>
@@ -2069,7 +1981,7 @@
           <w:color w:val="666666"/>
           <w:sz w:val="17"/>
         </w:rPr>
-        <w:t xml:space="preserve"> [625 znaków]</w:t>
+        <w:t xml:space="preserve"> [623 znaków]</w:t>
       </w:r>
     </w:p>
     <w:p>
@@ -2080,7 +1992,7 @@
         <w:rPr>
           <w:b w:val="0"/>
         </w:rPr>
-        <w:t>Wydatek zostanie poniesiony w EUR i oszacowano go na podstawie cenników historycznych kongresu z wcześniejszych edycji, bo organizator, TEG The Events Group, nie publikuje aktualnego cennika i jest jedynym dostawcą usługi. Przyjęto stoisko narożne 285 EUR/m² (minimum 6 m²) dla 9 m², czyli 2 565 EUR, oraz opłatę podstawową 350 EUR, razem 2 915 EUR. Po kursie średnim NBP z 09.03.2026, 4,2836 PLN/EUR, daje to 12 487 zł. Kwotę powiększono o waloryzację ok. 10,4% do poziomu cen z listopada 2028 r. (ok. 3,4% rocznie przez trzy lata), co daje 13 783 zł. Ujęto koszt według cennika historycznego z waloryzacją, a nie najniższy.</w:t>
+        <w:t>Wydatek zostanie poniesiony w EUR i oszacowano go na podstawie cenników historycznych kongresu z wcześniejszych edycji, bo organizator, TEG The Events Group, nie publikuje aktualnego cennika i jest jedynym dostawcą usługi. Przyjęto stoisko narożne 285 EUR/m² (minimum 6 m²) dla 9 m², czyli 2 565 EUR, oraz opłatę podstawową 350 EUR, razem 2 915 EUR. Po kursie średnim NBP z 09.03.2026, 4,2836 PLN/EUR, daje to 12 487 zł. Kwotę powiększono o waloryzację ok. 10% do poziomu cen z listopada 2028 r. (ok. 3,2% rocznie przez trzy lata), co daje 13 735 zł. Ujęto koszt według cennika historycznego z waloryzacją, a nie najniższy.</w:t>
       </w:r>
     </w:p>
     <w:p>
@@ -2114,7 +2026,7 @@
         <w:rPr>
           <w:b w:val="0"/>
         </w:rPr>
-        <w:t>10 217,00 zł netto.</w:t>
+        <w:t>10 184,00 zł netto.</w:t>
       </w:r>
     </w:p>
     <w:p>
@@ -2165,7 +2077,7 @@
           <w:color w:val="666666"/>
           <w:sz w:val="17"/>
         </w:rPr>
-        <w:t xml:space="preserve"> [666 znaków]</w:t>
+        <w:t xml:space="preserve"> [664 znaków]</w:t>
       </w:r>
     </w:p>
     <w:p>
@@ -2176,7 +2088,7 @@
         <w:rPr>
           <w:b w:val="0"/>
         </w:rPr>
-        <w:t>Wydatek zostanie poniesiony w EUR i oszacowano go na podstawie cenników historycznych kongresu z wcześniejszych edycji, bo organizator nie publikuje aktualnego cennika i jest jedynym dostawcą usługi. Przyjęto: energię i koszty pomocnicze ok. 130 EUR, gotową zabudowę 199 EUR/m² (górna granica zakresu 77,5 do 199 EUR/m²) dla 9 m², czyli 1 791 EUR, oraz meble 240 EUR (górna granica zakresu 120 do 240 EUR), razem 2 161 EUR. Po kursie średnim NBP z 09.03.2026, 4,2836 PLN/EUR, daje to 9 257 zł. Kwotę powiększono o waloryzację ok. 10,4% do poziomu cen z listopada 2028 r., co daje 10 217 zł. Razem pozycje 10-1 i 10-2 dają 24 000 zł. Ujęto górne granice zakresów cen.</w:t>
+        <w:t>Wydatek zostanie poniesiony w EUR i oszacowano go na podstawie cenników historycznych kongresu z wcześniejszych edycji, bo organizator nie publikuje aktualnego cennika i jest jedynym dostawcą usługi. Przyjęto: energię i koszty pomocnicze ok. 130 EUR, gotową zabudowę 199 EUR/m² (górna granica zakresu 77,5 do 199 EUR/m²) dla 9 m², czyli 1 791 EUR, oraz meble 240 EUR (górna granica zakresu 120 do 240 EUR), razem 2 161 EUR. Po kursie średnim NBP z 09.03.2026, 4,2836 PLN/EUR, daje to 9 257 zł. Kwotę powiększono o waloryzację ok. 10% do poziomu cen z listopada 2028 r., co daje 10 184 zł. Razem pozycje 10-1 i 10-2 dają 23 919 zł. Ujęto górne granice zakresów cen.</w:t>
       </w:r>
     </w:p>
     <w:p>
@@ -2306,7 +2218,7 @@
         <w:rPr>
           <w:b w:val="0"/>
         </w:rPr>
-        <w:t>13 000,00 zł netto.</w:t>
+        <w:t>14 000,00 zł netto.</w:t>
       </w:r>
     </w:p>
     <w:p>
@@ -2337,7 +2249,7 @@
         <w:rPr>
           <w:b w:val="0"/>
         </w:rPr>
-        <w:t>W ramach zaplanowanego kosztu niezbędne będzie wykonanie usług polegających na analizie rynków Czech, Słowacji, Węgier i Rumunii pod kątem regulacji i kanałów sprzedaży, opracowaniu modelu partnerstw z dostawcami TMS i warunków licencji API, a także przygotowaniu materiałów i scenariuszy rozmów na kongres i misję. Usługa będzie jednorazowa (nieciągła), z wyłączeniem doradztwa podatkowego, księgowego, prawnego oraz reklamy, a zewnętrzny doradca nie będzie w żaden sposób powiązany z Everest11. Powyższe prace zostaną zrealizowane w celu wsparcia i przygotowania procesu sprzedaży w regionie CEE, ponieważ Everest11 nie posiada w tym obszarze niezbędnego doświadczenia. Zaangażowanie: 13 dni x 8 h x 125 PLN (łączny czas podzielony na: 4 dni analizy, 5 dni na model partnerstw, 4 dni na materiały i scenariusze).</w:t>
+        <w:t>W ramach zaplanowanego kosztu niezbędne będzie wykonanie usług polegających na analizie rynków Czech, Słowacji, Węgier i Rumunii pod kątem regulacji i kanałów sprzedaży, opracowaniu modelu partnerstw z dostawcami TMS i warunków licencji API, a także przygotowaniu materiałów i scenariuszy rozmów na kongres i misję. Usługa będzie jednorazowa (nieciągła), z wyłączeniem doradztwa podatkowego, księgowego, prawnego oraz reklamy, a zewnętrzny doradca nie będzie w żaden sposób powiązany z Everest11. Powyższe prace zostaną zrealizowane w celu wsparcia i przygotowania procesu sprzedaży w regionie CEE, ponieważ Everest11 nie posiada w tym obszarze niezbędnego doświadczenia. Zaangażowanie: 14 dni x 8 h x 125 PLN (łączny czas podzielony na: 4 dni analizy, 5 dni na model partnerstw, 5 dni na materiały i scenariusze).</w:t>
       </w:r>
     </w:p>
     <w:p>
@@ -2368,7 +2280,7 @@
         <w:rPr>
           <w:b w:val="0"/>
         </w:rPr>
-        <w:t>Koszt jednostkowy 125 zł za godzinę, czyli 1 000 zł za dzień 8-godzinny, przyjęto na podstawie stawek rynkowych analityków biznesowych na poziomie mid i senior w kontraktach B2B (No Fluff Jobs, dostęp 2026). Liczba dni wynika z podziału zakresu: 4 plus 5 plus 4 dni, razem 13 dni, co daje 13 x 8 h x 125 zł = 13 000 zł. Wybór doradcy nastąpi w trybie rozeznania rynku przed rozpoczęciem usługi, a do rozliczenia zostanie przyjęta cena z wybranej oferty, nie wyższa niż kwota z wniosku.</w:t>
+        <w:t>Koszt jednostkowy 125 zł za godzinę, czyli 1 000 zł za dzień 8-godzinny, przyjęto na podstawie stawek rynkowych analityków biznesowych na poziomie mid i senior w kontraktach B2B (No Fluff Jobs, dostęp 2026). Liczba dni wynika z podziału zakresu: 4 plus 5 plus 5 dni, razem 14 dni, co daje 14 x 8 h x 125 zł = 14 000 zł. Wybór doradcy nastąpi w trybie rozeznania rynku przed rozpoczęciem usługi, a do rozliczenia zostanie przyjęta cena z wybranej oferty, nie wyższa niż kwota z wniosku.</w:t>
       </w:r>
     </w:p>
     <w:p>
@@ -3529,7 +3441,7 @@
         <w:rPr>
           <w:b w:val="0"/>
         </w:rPr>
-        <w:t>W polu metodologii zdanie „wykupionego pakietu wystawcy ujętego w budżecie zadania Z10 (24 000 PLN, 2 delegatów)” zastąp zdaniem: „opłaty za powierzchnię stoiska i opłaty podstawowej (z biletami dla dwóch delegatów) oraz energii, zabudowy i mebli, ujętych w budżecie zadania Z10, razem 24 000 zł”. Reszta bez zmian.</w:t>
+        <w:t>W polu metodologii zdanie „wykupionego pakietu wystawcy ujętego w budżecie zadania Z10 (24 000 PLN, 2 delegatów)” zastąp zdaniem: „opłaty za powierzchnię stoiska i opłaty podstawowej (z biletami dla dwóch delegatów) oraz energii, zabudowy i mebli, ujętych w budżecie zadania Z10, razem 23 919 zł”. Reszta bez zmian.</w:t>
       </w:r>
     </w:p>
     <w:p>
@@ -4157,7 +4069,7 @@
                 <w:b w:val="0"/>
                 <w:sz w:val="18"/>
               </w:rPr>
-              <w:t>Zgodne: koszt jednostkowy 125 zł/h, 13 dni, zakres w podziale 4 plus 5 plus 4.</w:t>
+              <w:t>Zgodne: koszt jednostkowy 125 zł/h, 14 dni, zakres w podziale 4 plus 5 plus 5.</w:t>
             </w:r>
           </w:p>
         </w:tc>

</xml_diff>